<commit_message>
Defined the hypothesies for the analysis and described the metrics collected during testing
</commit_message>
<xml_diff>
--- a/final_report/Report.docx
+++ b/final_report/Report.docx
@@ -5698,6 +5698,887 @@
     <w:p>
       <w:pPr>
         <w:rPr>
+          <w:sz w:val="28"/>
+          <w:szCs w:val="28"/>
+        </w:rPr>
+      </w:pPr>
+      <w:r>
+        <w:rPr>
+          <w:sz w:val="28"/>
+          <w:szCs w:val="28"/>
+          <w:lang w:val="en-US"/>
+        </w:rPr>
+        <w:t>Round</w:t>
+      </w:r>
+      <w:r>
+        <w:rPr>
+          <w:sz w:val="28"/>
+          <w:szCs w:val="28"/>
+        </w:rPr>
+        <w:t xml:space="preserve"> </w:t>
+      </w:r>
+      <w:r>
+        <w:rPr>
+          <w:sz w:val="28"/>
+          <w:szCs w:val="28"/>
+          <w:lang w:val="en-US"/>
+        </w:rPr>
+        <w:t>Robin</w:t>
+      </w:r>
+      <w:r>
+        <w:rPr>
+          <w:sz w:val="28"/>
+          <w:szCs w:val="28"/>
+        </w:rPr>
+        <w:t xml:space="preserve"> </w:t>
+      </w:r>
+      <w:r>
+        <w:rPr>
+          <w:sz w:val="28"/>
+          <w:szCs w:val="28"/>
+        </w:rPr>
+        <w:t xml:space="preserve">должен лучше всего показать себя в «простых» сценариях: сервера с одинаковым наполнением, одинаковые запросы или запросы с пренебрежительно малой стоимостью. Минимальный </w:t>
+      </w:r>
+      <w:proofErr w:type="spellStart"/>
+      <w:r>
+        <w:rPr>
+          <w:sz w:val="28"/>
+          <w:szCs w:val="28"/>
+        </w:rPr>
+        <w:t>оверхэд</w:t>
+      </w:r>
+      <w:proofErr w:type="spellEnd"/>
+      <w:r>
+        <w:rPr>
+          <w:sz w:val="28"/>
+          <w:szCs w:val="28"/>
+        </w:rPr>
+        <w:t xml:space="preserve"> и простота работы должны быть сильной стороной этого алгоритма.</w:t>
+      </w:r>
+    </w:p>
+    <w:p>
+      <w:pPr>
+        <w:rPr>
+          <w:sz w:val="28"/>
+          <w:szCs w:val="28"/>
+        </w:rPr>
+      </w:pPr>
+      <w:r>
+        <w:rPr>
+          <w:sz w:val="28"/>
+          <w:szCs w:val="28"/>
+        </w:rPr>
+        <w:t xml:space="preserve">Однако при любых сложных условиях </w:t>
+      </w:r>
+      <w:r>
+        <w:rPr>
+          <w:sz w:val="28"/>
+          <w:szCs w:val="28"/>
+          <w:lang w:val="en-US"/>
+        </w:rPr>
+        <w:t>Round</w:t>
+      </w:r>
+      <w:r>
+        <w:rPr>
+          <w:sz w:val="28"/>
+          <w:szCs w:val="28"/>
+        </w:rPr>
+        <w:t xml:space="preserve"> </w:t>
+      </w:r>
+      <w:r>
+        <w:rPr>
+          <w:sz w:val="28"/>
+          <w:szCs w:val="28"/>
+          <w:lang w:val="en-US"/>
+        </w:rPr>
+        <w:t>Robin</w:t>
+      </w:r>
+      <w:r>
+        <w:rPr>
+          <w:sz w:val="28"/>
+          <w:szCs w:val="28"/>
+        </w:rPr>
+        <w:t xml:space="preserve"> будет проигрывать более сложным алгоритмам. При разном наполнении серверов </w:t>
+      </w:r>
+      <w:r>
+        <w:rPr>
+          <w:sz w:val="28"/>
+          <w:szCs w:val="28"/>
+          <w:lang w:val="en-US"/>
+        </w:rPr>
+        <w:t>Round</w:t>
+      </w:r>
+      <w:r>
+        <w:rPr>
+          <w:sz w:val="28"/>
+          <w:szCs w:val="28"/>
+        </w:rPr>
+        <w:t xml:space="preserve"> </w:t>
+      </w:r>
+      <w:r>
+        <w:rPr>
+          <w:sz w:val="28"/>
+          <w:szCs w:val="28"/>
+          <w:lang w:val="en-US"/>
+        </w:rPr>
+        <w:t>Robin</w:t>
+      </w:r>
+      <w:r>
+        <w:rPr>
+          <w:sz w:val="28"/>
+          <w:szCs w:val="28"/>
+        </w:rPr>
+        <w:t xml:space="preserve"> </w:t>
+      </w:r>
+      <w:r>
+        <w:rPr>
+          <w:sz w:val="28"/>
+          <w:szCs w:val="28"/>
+        </w:rPr>
+        <w:t>никак не меняет свою работу, что приведёт к перегрузке «слабых» серверов.</w:t>
+      </w:r>
+    </w:p>
+    <w:p>
+      <w:pPr>
+        <w:pStyle w:val="a3"/>
+        <w:numPr>
+          <w:ilvl w:val="0"/>
+          <w:numId w:val="9"/>
+        </w:numPr>
+        <w:rPr>
+          <w:sz w:val="28"/>
+          <w:szCs w:val="28"/>
+        </w:rPr>
+      </w:pPr>
+      <w:r>
+        <w:rPr>
+          <w:sz w:val="28"/>
+          <w:szCs w:val="28"/>
+          <w:lang w:val="en-US"/>
+        </w:rPr>
+        <w:t>Weighted Round Robin</w:t>
+      </w:r>
+    </w:p>
+    <w:p>
+      <w:pPr>
+        <w:rPr>
+          <w:sz w:val="28"/>
+          <w:szCs w:val="28"/>
+        </w:rPr>
+      </w:pPr>
+      <w:r>
+        <w:rPr>
+          <w:sz w:val="28"/>
+          <w:szCs w:val="28"/>
+          <w:lang w:val="en-US"/>
+        </w:rPr>
+        <w:t>Weighted</w:t>
+      </w:r>
+      <w:r>
+        <w:rPr>
+          <w:sz w:val="28"/>
+          <w:szCs w:val="28"/>
+        </w:rPr>
+        <w:t xml:space="preserve"> </w:t>
+      </w:r>
+      <w:r>
+        <w:rPr>
+          <w:sz w:val="28"/>
+          <w:szCs w:val="28"/>
+          <w:lang w:val="en-US"/>
+        </w:rPr>
+        <w:t>Round</w:t>
+      </w:r>
+      <w:r>
+        <w:rPr>
+          <w:sz w:val="28"/>
+          <w:szCs w:val="28"/>
+        </w:rPr>
+        <w:t xml:space="preserve"> </w:t>
+      </w:r>
+      <w:r>
+        <w:rPr>
+          <w:sz w:val="28"/>
+          <w:szCs w:val="28"/>
+          <w:lang w:val="en-US"/>
+        </w:rPr>
+        <w:t>Robin</w:t>
+      </w:r>
+      <w:r>
+        <w:rPr>
+          <w:sz w:val="28"/>
+          <w:szCs w:val="28"/>
+        </w:rPr>
+        <w:t xml:space="preserve">, </w:t>
+      </w:r>
+      <w:r>
+        <w:rPr>
+          <w:sz w:val="28"/>
+          <w:szCs w:val="28"/>
+        </w:rPr>
+        <w:t>как</w:t>
+      </w:r>
+      <w:r>
+        <w:rPr>
+          <w:sz w:val="28"/>
+          <w:szCs w:val="28"/>
+        </w:rPr>
+        <w:t xml:space="preserve"> </w:t>
+      </w:r>
+      <w:r>
+        <w:rPr>
+          <w:sz w:val="28"/>
+          <w:szCs w:val="28"/>
+        </w:rPr>
+        <w:t>и</w:t>
+      </w:r>
+      <w:r>
+        <w:rPr>
+          <w:sz w:val="28"/>
+          <w:szCs w:val="28"/>
+        </w:rPr>
+        <w:t xml:space="preserve"> </w:t>
+      </w:r>
+      <w:r>
+        <w:rPr>
+          <w:sz w:val="28"/>
+          <w:szCs w:val="28"/>
+          <w:lang w:val="en-US"/>
+        </w:rPr>
+        <w:t>Round</w:t>
+      </w:r>
+      <w:r>
+        <w:rPr>
+          <w:sz w:val="28"/>
+          <w:szCs w:val="28"/>
+        </w:rPr>
+        <w:t xml:space="preserve"> </w:t>
+      </w:r>
+      <w:r>
+        <w:rPr>
+          <w:sz w:val="28"/>
+          <w:szCs w:val="28"/>
+          <w:lang w:val="en-US"/>
+        </w:rPr>
+        <w:t>Robin</w:t>
+      </w:r>
+      <w:r>
+        <w:rPr>
+          <w:sz w:val="28"/>
+          <w:szCs w:val="28"/>
+        </w:rPr>
+        <w:t xml:space="preserve">, </w:t>
+      </w:r>
+      <w:r>
+        <w:rPr>
+          <w:sz w:val="28"/>
+          <w:szCs w:val="28"/>
+        </w:rPr>
+        <w:t>будет</w:t>
+      </w:r>
+      <w:r>
+        <w:rPr>
+          <w:sz w:val="28"/>
+          <w:szCs w:val="28"/>
+        </w:rPr>
+        <w:t xml:space="preserve"> </w:t>
+      </w:r>
+      <w:r>
+        <w:rPr>
+          <w:sz w:val="28"/>
+          <w:szCs w:val="28"/>
+        </w:rPr>
+        <w:t>отлично</w:t>
+      </w:r>
+      <w:r>
+        <w:rPr>
+          <w:sz w:val="28"/>
+          <w:szCs w:val="28"/>
+        </w:rPr>
+        <w:t xml:space="preserve"> </w:t>
+      </w:r>
+      <w:r>
+        <w:rPr>
+          <w:sz w:val="28"/>
+          <w:szCs w:val="28"/>
+        </w:rPr>
+        <w:t xml:space="preserve">себя показывать при «простых» сценариях, но добавленная логика, связанная с весами серверов, должна в небольшой степени сделать его медленнее </w:t>
+      </w:r>
+      <w:r>
+        <w:rPr>
+          <w:sz w:val="28"/>
+          <w:szCs w:val="28"/>
+          <w:lang w:val="en-US"/>
+        </w:rPr>
+        <w:t>Round</w:t>
+      </w:r>
+      <w:r>
+        <w:rPr>
+          <w:sz w:val="28"/>
+          <w:szCs w:val="28"/>
+        </w:rPr>
+        <w:t xml:space="preserve"> </w:t>
+      </w:r>
+      <w:r>
+        <w:rPr>
+          <w:sz w:val="28"/>
+          <w:szCs w:val="28"/>
+          <w:lang w:val="en-US"/>
+        </w:rPr>
+        <w:t>Robin</w:t>
+      </w:r>
+      <w:r>
+        <w:rPr>
+          <w:sz w:val="28"/>
+          <w:szCs w:val="28"/>
+        </w:rPr>
+        <w:t>.</w:t>
+      </w:r>
+    </w:p>
+    <w:p>
+      <w:pPr>
+        <w:rPr>
+          <w:sz w:val="28"/>
+          <w:szCs w:val="28"/>
+        </w:rPr>
+      </w:pPr>
+      <w:r>
+        <w:rPr>
+          <w:sz w:val="28"/>
+          <w:szCs w:val="28"/>
+          <w:lang w:val="en-US"/>
+        </w:rPr>
+        <w:t>Weighted</w:t>
+      </w:r>
+      <w:r>
+        <w:rPr>
+          <w:sz w:val="28"/>
+          <w:szCs w:val="28"/>
+        </w:rPr>
+        <w:t xml:space="preserve"> </w:t>
+      </w:r>
+      <w:r>
+        <w:rPr>
+          <w:sz w:val="28"/>
+          <w:szCs w:val="28"/>
+          <w:lang w:val="en-US"/>
+        </w:rPr>
+        <w:t>Round</w:t>
+      </w:r>
+      <w:r>
+        <w:rPr>
+          <w:sz w:val="28"/>
+          <w:szCs w:val="28"/>
+        </w:rPr>
+        <w:t xml:space="preserve"> </w:t>
+      </w:r>
+      <w:r>
+        <w:rPr>
+          <w:sz w:val="28"/>
+          <w:szCs w:val="28"/>
+          <w:lang w:val="en-US"/>
+        </w:rPr>
+        <w:t>Robin</w:t>
+      </w:r>
+      <w:r>
+        <w:rPr>
+          <w:sz w:val="28"/>
+          <w:szCs w:val="28"/>
+        </w:rPr>
+        <w:t xml:space="preserve"> </w:t>
+      </w:r>
+      <w:r>
+        <w:rPr>
+          <w:sz w:val="28"/>
+          <w:szCs w:val="28"/>
+        </w:rPr>
+        <w:t>будет</w:t>
+      </w:r>
+      <w:r>
+        <w:rPr>
+          <w:sz w:val="28"/>
+          <w:szCs w:val="28"/>
+        </w:rPr>
+        <w:t xml:space="preserve"> </w:t>
+      </w:r>
+      <w:r>
+        <w:rPr>
+          <w:sz w:val="28"/>
+          <w:szCs w:val="28"/>
+        </w:rPr>
+        <w:t>способен</w:t>
+      </w:r>
+      <w:r>
+        <w:rPr>
+          <w:sz w:val="28"/>
+          <w:szCs w:val="28"/>
+        </w:rPr>
+        <w:t xml:space="preserve"> </w:t>
+      </w:r>
+      <w:r>
+        <w:rPr>
+          <w:sz w:val="28"/>
+          <w:szCs w:val="28"/>
+        </w:rPr>
+        <w:t xml:space="preserve">обрабатывать больше «сложных» ситуаций по сравнению с </w:t>
+      </w:r>
+      <w:r>
+        <w:rPr>
+          <w:sz w:val="28"/>
+          <w:szCs w:val="28"/>
+          <w:lang w:val="en-US"/>
+        </w:rPr>
+        <w:t>Round</w:t>
+      </w:r>
+      <w:r>
+        <w:rPr>
+          <w:sz w:val="28"/>
+          <w:szCs w:val="28"/>
+        </w:rPr>
+        <w:t xml:space="preserve"> </w:t>
+      </w:r>
+      <w:r>
+        <w:rPr>
+          <w:sz w:val="28"/>
+          <w:szCs w:val="28"/>
+          <w:lang w:val="en-US"/>
+        </w:rPr>
+        <w:t>Robin</w:t>
+      </w:r>
+      <w:r>
+        <w:rPr>
+          <w:sz w:val="28"/>
+          <w:szCs w:val="28"/>
+        </w:rPr>
+        <w:t>, при этом не сильно влияя на скорость распределения нагрузки.</w:t>
+      </w:r>
+    </w:p>
+    <w:p>
+      <w:pPr>
+        <w:rPr>
+          <w:sz w:val="28"/>
+          <w:szCs w:val="28"/>
+        </w:rPr>
+      </w:pPr>
+      <w:r>
+        <w:rPr>
+          <w:sz w:val="28"/>
+          <w:szCs w:val="28"/>
+        </w:rPr>
+        <w:t xml:space="preserve">Слабой стороной этого алгоритма будут профили по типу </w:t>
+      </w:r>
+      <w:r>
+        <w:rPr>
+          <w:sz w:val="28"/>
+          <w:szCs w:val="28"/>
+          <w:lang w:val="en-US"/>
+        </w:rPr>
+        <w:t>Variable</w:t>
+      </w:r>
+      <w:r>
+        <w:rPr>
+          <w:sz w:val="28"/>
+          <w:szCs w:val="28"/>
+        </w:rPr>
+        <w:t xml:space="preserve"> </w:t>
+      </w:r>
+      <w:r>
+        <w:rPr>
+          <w:sz w:val="28"/>
+          <w:szCs w:val="28"/>
+          <w:lang w:val="en-US"/>
+        </w:rPr>
+        <w:t>Request</w:t>
+      </w:r>
+      <w:r>
+        <w:rPr>
+          <w:sz w:val="28"/>
+          <w:szCs w:val="28"/>
+        </w:rPr>
+        <w:t xml:space="preserve"> </w:t>
+      </w:r>
+      <w:r>
+        <w:rPr>
+          <w:sz w:val="28"/>
+          <w:szCs w:val="28"/>
+          <w:lang w:val="en-US"/>
+        </w:rPr>
+        <w:t>Cost</w:t>
+      </w:r>
+      <w:r>
+        <w:rPr>
+          <w:sz w:val="28"/>
+          <w:szCs w:val="28"/>
+        </w:rPr>
+        <w:t xml:space="preserve"> </w:t>
+      </w:r>
+      <w:r>
+        <w:rPr>
+          <w:sz w:val="28"/>
+          <w:szCs w:val="28"/>
+        </w:rPr>
+        <w:t>–</w:t>
+      </w:r>
+      <w:r>
+        <w:rPr>
+          <w:sz w:val="28"/>
+          <w:szCs w:val="28"/>
+        </w:rPr>
+        <w:t xml:space="preserve"> </w:t>
+      </w:r>
+      <w:r>
+        <w:rPr>
+          <w:sz w:val="28"/>
+          <w:szCs w:val="28"/>
+        </w:rPr>
+        <w:t>алгоритм никак не берёт во внимание стоимость обработки запроса и текущую загруженность серверов, из-за чего он начнёт перегружать самые «сильные» сервера. Возможно, сервера справятся с нагрузкой и проблем не будет, но с этим алгоритмом нет такой гарантии: несколько дорогих запросов могут сильно перегрузить даже «сильный» сервер.</w:t>
+      </w:r>
+    </w:p>
+    <w:p>
+      <w:pPr>
+        <w:pStyle w:val="a3"/>
+        <w:numPr>
+          <w:ilvl w:val="0"/>
+          <w:numId w:val="9"/>
+        </w:numPr>
+        <w:rPr>
+          <w:sz w:val="28"/>
+          <w:szCs w:val="28"/>
+        </w:rPr>
+      </w:pPr>
+      <w:r>
+        <w:rPr>
+          <w:sz w:val="28"/>
+          <w:szCs w:val="28"/>
+          <w:lang w:val="en-US"/>
+        </w:rPr>
+        <w:t>Least Connections</w:t>
+      </w:r>
+    </w:p>
+    <w:p>
+      <w:pPr>
+        <w:rPr>
+          <w:sz w:val="28"/>
+          <w:szCs w:val="28"/>
+        </w:rPr>
+      </w:pPr>
+      <w:r>
+        <w:rPr>
+          <w:sz w:val="28"/>
+          <w:szCs w:val="28"/>
+        </w:rPr>
+        <w:t xml:space="preserve">У данного алгоритма наибольший </w:t>
+      </w:r>
+      <w:proofErr w:type="spellStart"/>
+      <w:r>
+        <w:rPr>
+          <w:sz w:val="28"/>
+          <w:szCs w:val="28"/>
+        </w:rPr>
+        <w:t>оверхэд</w:t>
+      </w:r>
+      <w:proofErr w:type="spellEnd"/>
+      <w:r>
+        <w:rPr>
+          <w:sz w:val="28"/>
+          <w:szCs w:val="28"/>
+        </w:rPr>
+        <w:t xml:space="preserve"> из разобранных ранее: необходимо вести статистику о текущих подключениях, опрашивать серверы при добавлении каждого запроса.</w:t>
+      </w:r>
+    </w:p>
+    <w:p>
+      <w:pPr>
+        <w:rPr>
+          <w:sz w:val="28"/>
+          <w:szCs w:val="28"/>
+        </w:rPr>
+      </w:pPr>
+      <w:r>
+        <w:rPr>
+          <w:sz w:val="28"/>
+          <w:szCs w:val="28"/>
+        </w:rPr>
+        <w:t xml:space="preserve">Алгоритм должен корректно работать в «простых» сценариях, но быть </w:t>
+      </w:r>
+      <w:proofErr w:type="spellStart"/>
+      <w:r>
+        <w:rPr>
+          <w:sz w:val="28"/>
+          <w:szCs w:val="28"/>
+        </w:rPr>
+        <w:t>медленее</w:t>
+      </w:r>
+      <w:proofErr w:type="spellEnd"/>
+      <w:r>
+        <w:rPr>
+          <w:sz w:val="28"/>
+          <w:szCs w:val="28"/>
+        </w:rPr>
+        <w:t xml:space="preserve"> </w:t>
+      </w:r>
+      <w:r>
+        <w:rPr>
+          <w:sz w:val="28"/>
+          <w:szCs w:val="28"/>
+          <w:lang w:val="en-US"/>
+        </w:rPr>
+        <w:t>Round</w:t>
+      </w:r>
+      <w:r>
+        <w:rPr>
+          <w:sz w:val="28"/>
+          <w:szCs w:val="28"/>
+        </w:rPr>
+        <w:t xml:space="preserve"> </w:t>
+      </w:r>
+      <w:r>
+        <w:rPr>
+          <w:sz w:val="28"/>
+          <w:szCs w:val="28"/>
+          <w:lang w:val="en-US"/>
+        </w:rPr>
+        <w:t>Robin</w:t>
+      </w:r>
+      <w:r>
+        <w:rPr>
+          <w:sz w:val="28"/>
+          <w:szCs w:val="28"/>
+        </w:rPr>
+        <w:t xml:space="preserve"> </w:t>
+      </w:r>
+      <w:r>
+        <w:rPr>
+          <w:sz w:val="28"/>
+          <w:szCs w:val="28"/>
+        </w:rPr>
+        <w:t xml:space="preserve">и </w:t>
+      </w:r>
+      <w:r>
+        <w:rPr>
+          <w:sz w:val="28"/>
+          <w:szCs w:val="28"/>
+          <w:lang w:val="en-US"/>
+        </w:rPr>
+        <w:t>Weighted</w:t>
+      </w:r>
+      <w:r>
+        <w:rPr>
+          <w:sz w:val="28"/>
+          <w:szCs w:val="28"/>
+        </w:rPr>
+        <w:t xml:space="preserve"> </w:t>
+      </w:r>
+      <w:r>
+        <w:rPr>
+          <w:sz w:val="28"/>
+          <w:szCs w:val="28"/>
+          <w:lang w:val="en-US"/>
+        </w:rPr>
+        <w:t>Round</w:t>
+      </w:r>
+      <w:r>
+        <w:rPr>
+          <w:sz w:val="28"/>
+          <w:szCs w:val="28"/>
+        </w:rPr>
+        <w:t xml:space="preserve"> </w:t>
+      </w:r>
+      <w:r>
+        <w:rPr>
+          <w:sz w:val="28"/>
+          <w:szCs w:val="28"/>
+          <w:lang w:val="en-US"/>
+        </w:rPr>
+        <w:t>Robin</w:t>
+      </w:r>
+      <w:r>
+        <w:rPr>
+          <w:sz w:val="28"/>
+          <w:szCs w:val="28"/>
+        </w:rPr>
+        <w:t>.</w:t>
+      </w:r>
+    </w:p>
+    <w:p>
+      <w:pPr>
+        <w:rPr>
+          <w:sz w:val="28"/>
+          <w:szCs w:val="28"/>
+        </w:rPr>
+      </w:pPr>
+      <w:r>
+        <w:rPr>
+          <w:sz w:val="28"/>
+          <w:szCs w:val="28"/>
+          <w:lang w:val="en-US"/>
+        </w:rPr>
+        <w:t>Least</w:t>
+      </w:r>
+      <w:r>
+        <w:rPr>
+          <w:sz w:val="28"/>
+          <w:szCs w:val="28"/>
+        </w:rPr>
+        <w:t xml:space="preserve"> </w:t>
+      </w:r>
+      <w:r>
+        <w:rPr>
+          <w:sz w:val="28"/>
+          <w:szCs w:val="28"/>
+          <w:lang w:val="en-US"/>
+        </w:rPr>
+        <w:t>Connections</w:t>
+      </w:r>
+      <w:r>
+        <w:rPr>
+          <w:sz w:val="28"/>
+          <w:szCs w:val="28"/>
+        </w:rPr>
+        <w:t xml:space="preserve"> </w:t>
+      </w:r>
+      <w:r>
+        <w:rPr>
+          <w:sz w:val="28"/>
+          <w:szCs w:val="28"/>
+        </w:rPr>
+        <w:t>будет</w:t>
+      </w:r>
+      <w:r>
+        <w:rPr>
+          <w:sz w:val="28"/>
+          <w:szCs w:val="28"/>
+        </w:rPr>
+        <w:t xml:space="preserve"> </w:t>
+      </w:r>
+      <w:r>
+        <w:rPr>
+          <w:sz w:val="28"/>
+          <w:szCs w:val="28"/>
+        </w:rPr>
+        <w:t>хорошо</w:t>
+      </w:r>
+      <w:r>
+        <w:rPr>
+          <w:sz w:val="28"/>
+          <w:szCs w:val="28"/>
+        </w:rPr>
+        <w:t xml:space="preserve"> </w:t>
+      </w:r>
+      <w:r>
+        <w:rPr>
+          <w:sz w:val="28"/>
+          <w:szCs w:val="28"/>
+        </w:rPr>
+        <w:t>показывать себя в наисложнейших ситуациях, так как этот алгоритм учитывает текущую загрузку серверов.</w:t>
+      </w:r>
+    </w:p>
+    <w:p>
+      <w:pPr>
+        <w:rPr>
+          <w:sz w:val="28"/>
+          <w:szCs w:val="28"/>
+        </w:rPr>
+      </w:pPr>
+      <w:r>
+        <w:rPr>
+          <w:sz w:val="28"/>
+          <w:szCs w:val="28"/>
+        </w:rPr>
+        <w:lastRenderedPageBreak/>
+        <w:t>В любом сценарии алгоритм стал бы нагружать сервера пропорционально их вычислительным способностям.</w:t>
+      </w:r>
+    </w:p>
+    <w:p>
+      <w:pPr>
+        <w:pStyle w:val="a3"/>
+        <w:numPr>
+          <w:ilvl w:val="0"/>
+          <w:numId w:val="9"/>
+        </w:numPr>
+        <w:rPr>
+          <w:sz w:val="28"/>
+          <w:szCs w:val="28"/>
+        </w:rPr>
+      </w:pPr>
+      <w:r>
+        <w:rPr>
+          <w:sz w:val="28"/>
+          <w:szCs w:val="28"/>
+          <w:lang w:val="en-US"/>
+        </w:rPr>
+        <w:t>Consistent Hashing</w:t>
+      </w:r>
+    </w:p>
+    <w:p>
+      <w:pPr>
+        <w:rPr>
+          <w:sz w:val="28"/>
+          <w:szCs w:val="28"/>
+        </w:rPr>
+      </w:pPr>
+      <w:r>
+        <w:rPr>
+          <w:sz w:val="28"/>
+          <w:szCs w:val="28"/>
+        </w:rPr>
+        <w:t xml:space="preserve">У всех предыдущих алгоритмов был большой минус – отсутствие гарантии того, что запросы от одного пользователя придут на один сервер. </w:t>
+      </w:r>
+      <w:r>
+        <w:rPr>
+          <w:sz w:val="28"/>
+          <w:szCs w:val="28"/>
+          <w:lang w:val="en-US"/>
+        </w:rPr>
+        <w:t>Consistent</w:t>
+      </w:r>
+      <w:r>
+        <w:rPr>
+          <w:sz w:val="28"/>
+          <w:szCs w:val="28"/>
+        </w:rPr>
+        <w:t xml:space="preserve"> </w:t>
+      </w:r>
+      <w:r>
+        <w:rPr>
+          <w:sz w:val="28"/>
+          <w:szCs w:val="28"/>
+          <w:lang w:val="en-US"/>
+        </w:rPr>
+        <w:t>Hashing</w:t>
+      </w:r>
+      <w:r>
+        <w:rPr>
+          <w:sz w:val="28"/>
+          <w:szCs w:val="28"/>
+        </w:rPr>
+        <w:t xml:space="preserve"> </w:t>
+      </w:r>
+      <w:r>
+        <w:rPr>
+          <w:sz w:val="28"/>
+          <w:szCs w:val="28"/>
+        </w:rPr>
+        <w:t xml:space="preserve">решит эту проблему, при этом он также должен работать не сильно дольше при </w:t>
+      </w:r>
+      <w:r>
+        <w:rPr>
+          <w:sz w:val="28"/>
+          <w:szCs w:val="28"/>
+          <w:lang w:val="en-US"/>
+        </w:rPr>
+        <w:t>Churn</w:t>
+      </w:r>
+      <w:r>
+        <w:rPr>
+          <w:sz w:val="28"/>
+          <w:szCs w:val="28"/>
+        </w:rPr>
+        <w:t>, чем при сценариях с неизменным составом серверов.</w:t>
+      </w:r>
+    </w:p>
+    <w:p>
+      <w:pPr>
+        <w:rPr>
           <w:sz w:val="36"/>
           <w:szCs w:val="36"/>
           <w:u w:val="single"/>
@@ -5724,6 +6605,503 @@
           <w:sz w:val="28"/>
           <w:szCs w:val="28"/>
         </w:rPr>
+        <w:t>Чтобы подтвердить (или опровергнуть) наши гипотезы, при запуске экспериментов измерялись следующие метрики:</w:t>
+      </w:r>
+    </w:p>
+    <w:p>
+      <w:pPr>
+        <w:pStyle w:val="a3"/>
+        <w:numPr>
+          <w:ilvl w:val="0"/>
+          <w:numId w:val="9"/>
+        </w:numPr>
+        <w:rPr>
+          <w:sz w:val="28"/>
+          <w:szCs w:val="28"/>
+        </w:rPr>
+      </w:pPr>
+      <w:r>
+        <w:rPr>
+          <w:sz w:val="28"/>
+          <w:szCs w:val="28"/>
+        </w:rPr>
+        <w:t>количество обработанных запросов в секунду</w:t>
+      </w:r>
+    </w:p>
+    <w:p>
+      <w:pPr>
+        <w:pStyle w:val="a3"/>
+        <w:numPr>
+          <w:ilvl w:val="0"/>
+          <w:numId w:val="9"/>
+        </w:numPr>
+        <w:rPr>
+          <w:sz w:val="28"/>
+          <w:szCs w:val="28"/>
+        </w:rPr>
+      </w:pPr>
+      <w:r>
+        <w:rPr>
+          <w:sz w:val="28"/>
+          <w:szCs w:val="28"/>
+        </w:rPr>
+        <w:t>время ожидания клиентом ответа на запрос</w:t>
+      </w:r>
+      <w:r>
+        <w:rPr>
+          <w:sz w:val="28"/>
+          <w:szCs w:val="28"/>
+        </w:rPr>
+        <w:t>:</w:t>
+      </w:r>
+    </w:p>
+    <w:p>
+      <w:pPr>
+        <w:pStyle w:val="a3"/>
+        <w:numPr>
+          <w:ilvl w:val="1"/>
+          <w:numId w:val="9"/>
+        </w:numPr>
+        <w:rPr>
+          <w:sz w:val="28"/>
+          <w:szCs w:val="28"/>
+        </w:rPr>
+      </w:pPr>
+      <w:r>
+        <w:rPr>
+          <w:sz w:val="28"/>
+          <w:szCs w:val="28"/>
+        </w:rPr>
+        <w:t>среднее</w:t>
+      </w:r>
+    </w:p>
+    <w:p>
+      <w:pPr>
+        <w:pStyle w:val="a3"/>
+        <w:numPr>
+          <w:ilvl w:val="1"/>
+          <w:numId w:val="9"/>
+        </w:numPr>
+        <w:rPr>
+          <w:sz w:val="28"/>
+          <w:szCs w:val="28"/>
+        </w:rPr>
+      </w:pPr>
+      <w:r>
+        <w:rPr>
+          <w:sz w:val="28"/>
+          <w:szCs w:val="28"/>
+        </w:rPr>
+        <w:t>медианное</w:t>
+      </w:r>
+    </w:p>
+    <w:p>
+      <w:pPr>
+        <w:pStyle w:val="a3"/>
+        <w:numPr>
+          <w:ilvl w:val="1"/>
+          <w:numId w:val="9"/>
+        </w:numPr>
+        <w:rPr>
+          <w:sz w:val="28"/>
+          <w:szCs w:val="28"/>
+        </w:rPr>
+      </w:pPr>
+      <w:r>
+        <w:rPr>
+          <w:sz w:val="28"/>
+          <w:szCs w:val="28"/>
+        </w:rPr>
+        <w:t>95 перцентиль</w:t>
+      </w:r>
+    </w:p>
+    <w:p>
+      <w:pPr>
+        <w:pStyle w:val="a3"/>
+        <w:numPr>
+          <w:ilvl w:val="1"/>
+          <w:numId w:val="9"/>
+        </w:numPr>
+        <w:rPr>
+          <w:sz w:val="28"/>
+          <w:szCs w:val="28"/>
+        </w:rPr>
+      </w:pPr>
+      <w:r>
+        <w:rPr>
+          <w:sz w:val="28"/>
+          <w:szCs w:val="28"/>
+        </w:rPr>
+        <w:t>99 перцентиль</w:t>
+      </w:r>
+    </w:p>
+    <w:p>
+      <w:pPr>
+        <w:pStyle w:val="a3"/>
+        <w:numPr>
+          <w:ilvl w:val="1"/>
+          <w:numId w:val="9"/>
+        </w:numPr>
+        <w:rPr>
+          <w:sz w:val="28"/>
+          <w:szCs w:val="28"/>
+        </w:rPr>
+      </w:pPr>
+      <w:r>
+        <w:rPr>
+          <w:sz w:val="28"/>
+          <w:szCs w:val="28"/>
+        </w:rPr>
+        <w:t>минимум</w:t>
+      </w:r>
+    </w:p>
+    <w:p>
+      <w:pPr>
+        <w:pStyle w:val="a3"/>
+        <w:numPr>
+          <w:ilvl w:val="1"/>
+          <w:numId w:val="9"/>
+        </w:numPr>
+        <w:rPr>
+          <w:sz w:val="28"/>
+          <w:szCs w:val="28"/>
+        </w:rPr>
+      </w:pPr>
+      <w:r>
+        <w:rPr>
+          <w:sz w:val="28"/>
+          <w:szCs w:val="28"/>
+        </w:rPr>
+        <w:t>максимум</w:t>
+      </w:r>
+    </w:p>
+    <w:p>
+      <w:pPr>
+        <w:pStyle w:val="a3"/>
+        <w:numPr>
+          <w:ilvl w:val="1"/>
+          <w:numId w:val="9"/>
+        </w:numPr>
+        <w:rPr>
+          <w:sz w:val="28"/>
+          <w:szCs w:val="28"/>
+        </w:rPr>
+      </w:pPr>
+      <w:r>
+        <w:rPr>
+          <w:sz w:val="28"/>
+          <w:szCs w:val="28"/>
+        </w:rPr>
+        <w:t>гистограмма латентности всех запросов</w:t>
+      </w:r>
+    </w:p>
+    <w:p>
+      <w:pPr>
+        <w:pStyle w:val="a3"/>
+        <w:numPr>
+          <w:ilvl w:val="0"/>
+          <w:numId w:val="9"/>
+        </w:numPr>
+        <w:rPr>
+          <w:sz w:val="28"/>
+          <w:szCs w:val="28"/>
+        </w:rPr>
+      </w:pPr>
+      <w:r>
+        <w:rPr>
+          <w:sz w:val="28"/>
+          <w:szCs w:val="28"/>
+        </w:rPr>
+        <w:t>измерения в динамике во времени:</w:t>
+      </w:r>
+    </w:p>
+    <w:p>
+      <w:pPr>
+        <w:pStyle w:val="a3"/>
+        <w:numPr>
+          <w:ilvl w:val="1"/>
+          <w:numId w:val="9"/>
+        </w:numPr>
+        <w:rPr>
+          <w:sz w:val="28"/>
+          <w:szCs w:val="28"/>
+        </w:rPr>
+      </w:pPr>
+      <w:r>
+        <w:rPr>
+          <w:sz w:val="28"/>
+          <w:szCs w:val="28"/>
+        </w:rPr>
+        <w:t>активные соединения</w:t>
+      </w:r>
+    </w:p>
+    <w:p>
+      <w:pPr>
+        <w:pStyle w:val="a3"/>
+        <w:numPr>
+          <w:ilvl w:val="1"/>
+          <w:numId w:val="9"/>
+        </w:numPr>
+        <w:rPr>
+          <w:sz w:val="28"/>
+          <w:szCs w:val="28"/>
+        </w:rPr>
+      </w:pPr>
+      <w:r>
+        <w:rPr>
+          <w:sz w:val="28"/>
+          <w:szCs w:val="28"/>
+        </w:rPr>
+        <w:t>средняя латентность</w:t>
+      </w:r>
+    </w:p>
+    <w:p>
+      <w:pPr>
+        <w:pStyle w:val="a3"/>
+        <w:numPr>
+          <w:ilvl w:val="1"/>
+          <w:numId w:val="9"/>
+        </w:numPr>
+        <w:rPr>
+          <w:sz w:val="28"/>
+          <w:szCs w:val="28"/>
+        </w:rPr>
+      </w:pPr>
+      <w:r>
+        <w:rPr>
+          <w:sz w:val="28"/>
+          <w:szCs w:val="28"/>
+        </w:rPr>
+        <w:t>95 перцентиль латентности</w:t>
+      </w:r>
+    </w:p>
+    <w:p>
+      <w:pPr>
+        <w:pStyle w:val="a3"/>
+        <w:numPr>
+          <w:ilvl w:val="1"/>
+          <w:numId w:val="9"/>
+        </w:numPr>
+        <w:rPr>
+          <w:sz w:val="28"/>
+          <w:szCs w:val="28"/>
+        </w:rPr>
+      </w:pPr>
+      <w:r>
+        <w:rPr>
+          <w:sz w:val="28"/>
+          <w:szCs w:val="28"/>
+        </w:rPr>
+        <w:t>средняя нагрузка на сервера</w:t>
+      </w:r>
+    </w:p>
+    <w:p>
+      <w:pPr>
+        <w:pStyle w:val="a3"/>
+        <w:numPr>
+          <w:ilvl w:val="1"/>
+          <w:numId w:val="9"/>
+        </w:numPr>
+        <w:rPr>
+          <w:sz w:val="28"/>
+          <w:szCs w:val="28"/>
+        </w:rPr>
+      </w:pPr>
+      <w:r>
+        <w:rPr>
+          <w:sz w:val="28"/>
+          <w:szCs w:val="28"/>
+        </w:rPr>
+        <w:t>динамика запросов (количество новых запросов, запросов «на пути» к клиенту, успешные и провальные запросы)</w:t>
+      </w:r>
+    </w:p>
+    <w:p>
+      <w:pPr>
+        <w:pStyle w:val="a3"/>
+        <w:numPr>
+          <w:ilvl w:val="0"/>
+          <w:numId w:val="9"/>
+        </w:numPr>
+        <w:rPr>
+          <w:sz w:val="28"/>
+          <w:szCs w:val="28"/>
+        </w:rPr>
+      </w:pPr>
+      <w:r>
+        <w:rPr>
+          <w:sz w:val="28"/>
+          <w:szCs w:val="28"/>
+        </w:rPr>
+        <w:t>индивидуальная статистика по серверам</w:t>
+      </w:r>
+    </w:p>
+    <w:p>
+      <w:pPr>
+        <w:pStyle w:val="a3"/>
+        <w:numPr>
+          <w:ilvl w:val="1"/>
+          <w:numId w:val="9"/>
+        </w:numPr>
+        <w:rPr>
+          <w:sz w:val="28"/>
+          <w:szCs w:val="28"/>
+        </w:rPr>
+      </w:pPr>
+      <w:r>
+        <w:rPr>
+          <w:sz w:val="28"/>
+          <w:szCs w:val="28"/>
+        </w:rPr>
+        <w:t>количество обработанных запросов (успехи и отказы)</w:t>
+      </w:r>
+    </w:p>
+    <w:p>
+      <w:pPr>
+        <w:pStyle w:val="a3"/>
+        <w:numPr>
+          <w:ilvl w:val="1"/>
+          <w:numId w:val="9"/>
+        </w:numPr>
+        <w:rPr>
+          <w:sz w:val="28"/>
+          <w:szCs w:val="28"/>
+        </w:rPr>
+      </w:pPr>
+      <w:r>
+        <w:rPr>
+          <w:sz w:val="28"/>
+          <w:szCs w:val="28"/>
+        </w:rPr>
+        <w:t>латентность запросов (минимальная, средняя, максимальная)</w:t>
+      </w:r>
+    </w:p>
+    <w:p>
+      <w:pPr>
+        <w:pStyle w:val="a3"/>
+        <w:numPr>
+          <w:ilvl w:val="1"/>
+          <w:numId w:val="9"/>
+        </w:numPr>
+        <w:rPr>
+          <w:sz w:val="28"/>
+          <w:szCs w:val="28"/>
+        </w:rPr>
+      </w:pPr>
+      <w:r>
+        <w:rPr>
+          <w:sz w:val="28"/>
+          <w:szCs w:val="28"/>
+        </w:rPr>
+        <w:t>нагрузка по мере эксперимента (средняя и максимальная)</w:t>
+      </w:r>
+    </w:p>
+    <w:p>
+      <w:pPr>
+        <w:pStyle w:val="a3"/>
+        <w:numPr>
+          <w:ilvl w:val="0"/>
+          <w:numId w:val="9"/>
+        </w:numPr>
+        <w:rPr>
+          <w:sz w:val="28"/>
+          <w:szCs w:val="28"/>
+        </w:rPr>
+      </w:pPr>
+      <w:r>
+        <w:rPr>
+          <w:sz w:val="28"/>
+          <w:szCs w:val="28"/>
+        </w:rPr>
+        <w:t>индивидуальная статистика по группам клиентов</w:t>
+      </w:r>
+    </w:p>
+    <w:p>
+      <w:pPr>
+        <w:pStyle w:val="a3"/>
+        <w:numPr>
+          <w:ilvl w:val="1"/>
+          <w:numId w:val="9"/>
+        </w:numPr>
+        <w:rPr>
+          <w:sz w:val="28"/>
+          <w:szCs w:val="28"/>
+        </w:rPr>
+      </w:pPr>
+      <w:r>
+        <w:rPr>
+          <w:sz w:val="28"/>
+          <w:szCs w:val="28"/>
+        </w:rPr>
+        <w:t>отправленные запросы</w:t>
+      </w:r>
+    </w:p>
+    <w:p>
+      <w:pPr>
+        <w:pStyle w:val="a3"/>
+        <w:numPr>
+          <w:ilvl w:val="1"/>
+          <w:numId w:val="9"/>
+        </w:numPr>
+        <w:rPr>
+          <w:sz w:val="28"/>
+          <w:szCs w:val="28"/>
+        </w:rPr>
+      </w:pPr>
+      <w:r>
+        <w:rPr>
+          <w:sz w:val="28"/>
+          <w:szCs w:val="28"/>
+        </w:rPr>
+        <w:t>полученные успехи и отказы</w:t>
+      </w:r>
+    </w:p>
+    <w:p>
+      <w:pPr>
+        <w:pStyle w:val="a3"/>
+        <w:numPr>
+          <w:ilvl w:val="1"/>
+          <w:numId w:val="9"/>
+        </w:numPr>
+        <w:rPr>
+          <w:sz w:val="28"/>
+          <w:szCs w:val="28"/>
+        </w:rPr>
+      </w:pPr>
+      <w:r>
+        <w:rPr>
+          <w:sz w:val="28"/>
+          <w:szCs w:val="28"/>
+        </w:rPr>
+        <w:t xml:space="preserve">латентность (средняя, </w:t>
+      </w:r>
+      <w:r>
+        <w:rPr>
+          <w:sz w:val="28"/>
+          <w:szCs w:val="28"/>
+          <w:lang w:val="en-US"/>
+        </w:rPr>
+        <w:t xml:space="preserve">p95, </w:t>
+      </w:r>
+      <w:r>
+        <w:rPr>
+          <w:sz w:val="28"/>
+          <w:szCs w:val="28"/>
+        </w:rPr>
+        <w:t>максимальная)</w:t>
+      </w:r>
+    </w:p>
+    <w:p>
+      <w:pPr>
+        <w:rPr>
+          <w:sz w:val="28"/>
+          <w:szCs w:val="28"/>
+        </w:rPr>
+      </w:pPr>
+      <w:r>
+        <w:rPr>
+          <w:sz w:val="28"/>
+          <w:szCs w:val="28"/>
+        </w:rPr>
         <w:t>&lt;</w:t>
       </w:r>
       <w:r>
@@ -5731,199 +7109,7 @@
           <w:sz w:val="28"/>
           <w:szCs w:val="28"/>
         </w:rPr>
-        <w:t xml:space="preserve">интро к данным, сводная таблица с данными – </w:t>
-      </w:r>
-      <w:r>
-        <w:rPr>
-          <w:sz w:val="28"/>
-          <w:szCs w:val="28"/>
-          <w:lang w:val="en-US"/>
-        </w:rPr>
-        <w:t>RPS</w:t>
-      </w:r>
-      <w:r>
-        <w:rPr>
-          <w:sz w:val="28"/>
-          <w:szCs w:val="28"/>
-        </w:rPr>
-        <w:t xml:space="preserve">, </w:t>
-      </w:r>
-      <w:r>
-        <w:rPr>
-          <w:sz w:val="28"/>
-          <w:szCs w:val="28"/>
-          <w:lang w:val="en-US"/>
-        </w:rPr>
-        <w:t>mean</w:t>
-      </w:r>
-      <w:r>
-        <w:rPr>
-          <w:sz w:val="28"/>
-          <w:szCs w:val="28"/>
-        </w:rPr>
-        <w:t xml:space="preserve"> </w:t>
-      </w:r>
-      <w:proofErr w:type="spellStart"/>
-      <w:r>
-        <w:rPr>
-          <w:sz w:val="28"/>
-          <w:szCs w:val="28"/>
-          <w:lang w:val="en-US"/>
-        </w:rPr>
-        <w:t>ms</w:t>
-      </w:r>
-      <w:proofErr w:type="spellEnd"/>
-      <w:r>
-        <w:rPr>
-          <w:sz w:val="28"/>
-          <w:szCs w:val="28"/>
-        </w:rPr>
-        <w:t xml:space="preserve">, </w:t>
-      </w:r>
-      <w:r>
-        <w:rPr>
-          <w:sz w:val="28"/>
-          <w:szCs w:val="28"/>
-          <w:lang w:val="en-US"/>
-        </w:rPr>
-        <w:t>p</w:t>
-      </w:r>
-      <w:r>
-        <w:rPr>
-          <w:sz w:val="28"/>
-          <w:szCs w:val="28"/>
-        </w:rPr>
-        <w:t xml:space="preserve">95 </w:t>
-      </w:r>
-      <w:proofErr w:type="spellStart"/>
-      <w:r>
-        <w:rPr>
-          <w:sz w:val="28"/>
-          <w:szCs w:val="28"/>
-          <w:lang w:val="en-US"/>
-        </w:rPr>
-        <w:t>ms</w:t>
-      </w:r>
-      <w:proofErr w:type="spellEnd"/>
-      <w:r>
-        <w:rPr>
-          <w:sz w:val="28"/>
-          <w:szCs w:val="28"/>
-        </w:rPr>
-        <w:t xml:space="preserve">, </w:t>
-      </w:r>
-      <w:r>
-        <w:rPr>
-          <w:sz w:val="28"/>
-          <w:szCs w:val="28"/>
-          <w:lang w:val="en-US"/>
-        </w:rPr>
-        <w:t>p</w:t>
-      </w:r>
-      <w:r>
-        <w:rPr>
-          <w:sz w:val="28"/>
-          <w:szCs w:val="28"/>
-        </w:rPr>
-        <w:t xml:space="preserve">99 </w:t>
-      </w:r>
-      <w:proofErr w:type="spellStart"/>
-      <w:r>
-        <w:rPr>
-          <w:sz w:val="28"/>
-          <w:szCs w:val="28"/>
-          <w:lang w:val="en-US"/>
-        </w:rPr>
-        <w:t>ms</w:t>
-      </w:r>
-      <w:proofErr w:type="spellEnd"/>
-      <w:r>
-        <w:rPr>
-          <w:sz w:val="28"/>
-          <w:szCs w:val="28"/>
-        </w:rPr>
-        <w:t xml:space="preserve">, </w:t>
-      </w:r>
-      <w:r>
-        <w:rPr>
-          <w:sz w:val="28"/>
-          <w:szCs w:val="28"/>
-        </w:rPr>
-        <w:t>запросы</w:t>
-      </w:r>
-      <w:r>
-        <w:rPr>
-          <w:sz w:val="28"/>
-          <w:szCs w:val="28"/>
-        </w:rPr>
-        <w:t>/</w:t>
-      </w:r>
-      <w:r>
-        <w:rPr>
-          <w:sz w:val="28"/>
-          <w:szCs w:val="28"/>
-        </w:rPr>
-        <w:t xml:space="preserve">сервер, </w:t>
-      </w:r>
-      <w:r>
-        <w:rPr>
-          <w:sz w:val="28"/>
-          <w:szCs w:val="28"/>
-          <w:lang w:val="en-US"/>
-        </w:rPr>
-        <w:t>avg</w:t>
-      </w:r>
-      <w:r>
-        <w:rPr>
-          <w:sz w:val="28"/>
-          <w:szCs w:val="28"/>
-        </w:rPr>
-        <w:t xml:space="preserve"> </w:t>
-      </w:r>
-      <w:r>
-        <w:rPr>
-          <w:sz w:val="28"/>
-          <w:szCs w:val="28"/>
-          <w:lang w:val="en-US"/>
-        </w:rPr>
-        <w:t>load</w:t>
-      </w:r>
-      <w:r>
-        <w:rPr>
-          <w:sz w:val="28"/>
-          <w:szCs w:val="28"/>
-        </w:rPr>
-        <w:t xml:space="preserve">, </w:t>
-      </w:r>
-      <w:r>
-        <w:rPr>
-          <w:sz w:val="28"/>
-          <w:szCs w:val="28"/>
-          <w:lang w:val="en-US"/>
-        </w:rPr>
-        <w:t>max</w:t>
-      </w:r>
-      <w:r>
-        <w:rPr>
-          <w:sz w:val="28"/>
-          <w:szCs w:val="28"/>
-        </w:rPr>
-        <w:t xml:space="preserve"> </w:t>
-      </w:r>
-      <w:r>
-        <w:rPr>
-          <w:sz w:val="28"/>
-          <w:szCs w:val="28"/>
-          <w:lang w:val="en-US"/>
-        </w:rPr>
-        <w:t>load</w:t>
-      </w:r>
-      <w:r>
-        <w:rPr>
-          <w:sz w:val="28"/>
-          <w:szCs w:val="28"/>
-        </w:rPr>
-        <w:t>, комментарии</w:t>
+        <w:t>сводная таблица с данными, комментарии</w:t>
       </w:r>
       <w:r>
         <w:rPr>
@@ -5947,52 +7133,61 @@
           <w:szCs w:val="36"/>
           <w:u w:val="single"/>
         </w:rPr>
-        <w:t>Выводы</w:t>
-      </w:r>
-    </w:p>
-    <w:p>
-      <w:pPr>
-        <w:rPr>
-          <w:sz w:val="28"/>
-          <w:szCs w:val="28"/>
-        </w:rPr>
-      </w:pPr>
-      <w:r>
-        <w:rPr>
-          <w:sz w:val="28"/>
-          <w:szCs w:val="28"/>
-        </w:rPr>
-        <w:t>&lt;</w:t>
-      </w:r>
-      <w:r>
-        <w:rPr>
-          <w:sz w:val="28"/>
-          <w:szCs w:val="28"/>
-        </w:rPr>
-        <w:t>выводы про правильность гипотез и реальные данные</w:t>
-      </w:r>
-      <w:r>
-        <w:rPr>
-          <w:sz w:val="28"/>
-          <w:szCs w:val="28"/>
-        </w:rPr>
-        <w:t>&gt;</w:t>
-      </w:r>
-    </w:p>
-    <w:p>
-      <w:pPr>
+        <w:lastRenderedPageBreak/>
+        <w:t>Анализ данных и в</w:t>
+      </w:r>
+      <w:r>
         <w:rPr>
           <w:sz w:val="36"/>
           <w:szCs w:val="36"/>
           <w:u w:val="single"/>
         </w:rPr>
-      </w:pPr>
-      <w:r>
+        <w:t>ыводы</w:t>
+      </w:r>
+    </w:p>
+    <w:p>
+      <w:pPr>
+        <w:rPr>
+          <w:sz w:val="28"/>
+          <w:szCs w:val="28"/>
+        </w:rPr>
+      </w:pPr>
+      <w:r>
+        <w:rPr>
+          <w:sz w:val="28"/>
+          <w:szCs w:val="28"/>
+        </w:rPr>
+        <w:t>&lt;</w:t>
+      </w:r>
+      <w:r>
+        <w:rPr>
+          <w:sz w:val="28"/>
+          <w:szCs w:val="28"/>
+        </w:rPr>
+        <w:t>выводы про правильность гипотез и реальные данные</w:t>
+      </w:r>
+      <w:r>
+        <w:rPr>
+          <w:sz w:val="28"/>
+          <w:szCs w:val="28"/>
+        </w:rPr>
+        <w:t>&gt;</w:t>
+      </w:r>
+    </w:p>
+    <w:p>
+      <w:pPr>
         <w:rPr>
           <w:sz w:val="36"/>
           <w:szCs w:val="36"/>
           <w:u w:val="single"/>
         </w:rPr>
+      </w:pPr>
+      <w:r>
+        <w:rPr>
+          <w:sz w:val="36"/>
+          <w:szCs w:val="36"/>
+          <w:u w:val="single"/>
+        </w:rPr>
         <w:t>Распределение задач</w:t>
       </w:r>
     </w:p>
@@ -6472,7 +7667,6 @@
           <w:szCs w:val="28"/>
           <w:lang w:val="en-US"/>
         </w:rPr>
-        <w:lastRenderedPageBreak/>
         <w:t xml:space="preserve">feature/graphics: </w:t>
       </w:r>
       <w:proofErr w:type="spellStart"/>
@@ -7606,7 +8800,7 @@
   <w:abstractNum w:abstractNumId="8" w15:restartNumberingAfterBreak="0">
     <w:nsid w:val="775B2538"/>
     <w:multiLevelType w:val="hybridMultilevel"/>
-    <w:tmpl w:val="235CE0CE"/>
+    <w:tmpl w:val="BE7AC3BC"/>
     <w:lvl w:ilvl="0" w:tplc="04190001">
       <w:start w:val="1"/>
       <w:numFmt w:val="bullet"/>
@@ -7619,7 +8813,7 @@
         <w:rFonts w:ascii="Symbol" w:hAnsi="Symbol" w:hint="default"/>
       </w:rPr>
     </w:lvl>
-    <w:lvl w:ilvl="1" w:tplc="04190003" w:tentative="1">
+    <w:lvl w:ilvl="1" w:tplc="04190003">
       <w:start w:val="1"/>
       <w:numFmt w:val="bullet"/>
       <w:lvlText w:val="o"/>

</xml_diff>

<commit_message>
Finished analysis part and results table
</commit_message>
<xml_diff>
--- a/final_report/Report.docx
+++ b/final_report/Report.docx
@@ -7130,8 +7130,30 @@
         <w:rPr>
           <w:sz w:val="28"/>
           <w:szCs w:val="28"/>
+          <w:lang w:val="en-US"/>
+        </w:rPr>
+        <w:t>throughput</w:t>
+      </w:r>
+      <w:r>
+        <w:rPr>
+          <w:sz w:val="28"/>
+          <w:szCs w:val="28"/>
+        </w:rPr>
+        <w:t xml:space="preserve"> – </w:t>
+      </w:r>
+      <w:r>
+        <w:rPr>
+          <w:sz w:val="28"/>
+          <w:szCs w:val="28"/>
         </w:rPr>
         <w:t>количество обработанных запросов в секунду</w:t>
+      </w:r>
+      <w:r>
+        <w:rPr>
+          <w:sz w:val="28"/>
+          <w:szCs w:val="28"/>
+        </w:rPr>
+        <w:t>;</w:t>
       </w:r>
     </w:p>
     <w:p>
@@ -7153,6 +7175,13 @@
         </w:rPr>
         <w:t>медианная латентность</w:t>
       </w:r>
+      <w:r>
+        <w:rPr>
+          <w:sz w:val="28"/>
+          <w:szCs w:val="28"/>
+        </w:rPr>
+        <w:t>;</w:t>
+      </w:r>
     </w:p>
     <w:p>
       <w:pPr>
@@ -7173,6 +7202,13 @@
         </w:rPr>
         <w:t>средняя латентность</w:t>
       </w:r>
+      <w:r>
+        <w:rPr>
+          <w:sz w:val="28"/>
+          <w:szCs w:val="28"/>
+        </w:rPr>
+        <w:t>;</w:t>
+      </w:r>
     </w:p>
     <w:p>
       <w:pPr>
@@ -7208,6 +7244,13 @@
         </w:rPr>
         <w:t>95</w:t>
       </w:r>
+      <w:r>
+        <w:rPr>
+          <w:sz w:val="28"/>
+          <w:szCs w:val="28"/>
+        </w:rPr>
+        <w:t>;</w:t>
+      </w:r>
     </w:p>
     <w:p>
       <w:pPr>
@@ -7243,6 +7286,13 @@
         </w:rPr>
         <w:t>99</w:t>
       </w:r>
+      <w:r>
+        <w:rPr>
+          <w:sz w:val="28"/>
+          <w:szCs w:val="28"/>
+        </w:rPr>
+        <w:t>;</w:t>
+      </w:r>
     </w:p>
     <w:p>
       <w:pPr>
@@ -7342,7 +7392,7 @@
           <w:szCs w:val="28"/>
           <w:lang w:val="en-US"/>
         </w:rPr>
-        <w:t>avg</w:t>
+        <w:t>peak</w:t>
       </w:r>
       <w:r>
         <w:rPr>
@@ -7402,7 +7452,7 @@
           <w:szCs w:val="28"/>
           <w:lang w:val="en-US"/>
         </w:rPr>
-        <w:t>avg</w:t>
+        <w:t>peak</w:t>
       </w:r>
       <w:r>
         <w:rPr>
@@ -7448,7 +7498,195 @@
           <w:sz w:val="28"/>
           <w:szCs w:val="28"/>
         </w:rPr>
-        <w:t>чем больше величина, тем менее равномерно распределена нагрузка</w:t>
+        <w:t>Ч</w:t>
+      </w:r>
+      <w:r>
+        <w:rPr>
+          <w:sz w:val="28"/>
+          <w:szCs w:val="28"/>
+        </w:rPr>
+        <w:t>ем больше величина, тем менее равномерно распределена нагрузка</w:t>
+      </w:r>
+      <w:r>
+        <w:rPr>
+          <w:sz w:val="28"/>
+          <w:szCs w:val="28"/>
+        </w:rPr>
+        <w:t>.</w:t>
+      </w:r>
+    </w:p>
+    <w:p>
+      <w:pPr>
+        <w:pStyle w:val="a3"/>
+        <w:rPr>
+          <w:sz w:val="28"/>
+          <w:szCs w:val="28"/>
+        </w:rPr>
+      </w:pPr>
+      <w:r>
+        <w:rPr>
+          <w:sz w:val="28"/>
+          <w:szCs w:val="28"/>
+        </w:rPr>
+        <w:t xml:space="preserve">Что означают разные уровни </w:t>
+      </w:r>
+      <w:r>
+        <w:rPr>
+          <w:sz w:val="28"/>
+          <w:szCs w:val="28"/>
+          <w:lang w:val="en-US"/>
+        </w:rPr>
+        <w:t>disparity</w:t>
+      </w:r>
+      <w:r>
+        <w:rPr>
+          <w:sz w:val="28"/>
+          <w:szCs w:val="28"/>
+        </w:rPr>
+        <w:t>:</w:t>
+      </w:r>
+    </w:p>
+    <w:p>
+      <w:pPr>
+        <w:pStyle w:val="a3"/>
+        <w:numPr>
+          <w:ilvl w:val="1"/>
+          <w:numId w:val="10"/>
+        </w:numPr>
+        <w:rPr>
+          <w:sz w:val="28"/>
+          <w:szCs w:val="28"/>
+        </w:rPr>
+      </w:pPr>
+      <w:r>
+        <w:rPr>
+          <w:sz w:val="28"/>
+          <w:szCs w:val="28"/>
+          <w:lang w:val="en-US"/>
+        </w:rPr>
+        <w:t>disparity</w:t>
+      </w:r>
+      <w:r>
+        <w:rPr>
+          <w:sz w:val="28"/>
+          <w:szCs w:val="28"/>
+        </w:rPr>
+        <w:t xml:space="preserve"> </w:t>
+      </w:r>
+      <w:r>
+        <w:rPr>
+          <w:sz w:val="28"/>
+          <w:szCs w:val="28"/>
+        </w:rPr>
+        <w:t>≈</w:t>
+      </w:r>
+      <w:r>
+        <w:t xml:space="preserve"> </w:t>
+      </w:r>
+      <w:r>
+        <w:rPr>
+          <w:sz w:val="28"/>
+          <w:szCs w:val="28"/>
+        </w:rPr>
+        <w:t xml:space="preserve">0 – </w:t>
+      </w:r>
+      <w:r>
+        <w:rPr>
+          <w:sz w:val="28"/>
+          <w:szCs w:val="28"/>
+        </w:rPr>
+        <w:t>идеально равномерное распределение нагрузки по серверам;</w:t>
+      </w:r>
+    </w:p>
+    <w:p>
+      <w:pPr>
+        <w:pStyle w:val="a3"/>
+        <w:numPr>
+          <w:ilvl w:val="1"/>
+          <w:numId w:val="10"/>
+        </w:numPr>
+        <w:rPr>
+          <w:sz w:val="28"/>
+          <w:szCs w:val="28"/>
+        </w:rPr>
+      </w:pPr>
+      <w:r>
+        <w:rPr>
+          <w:sz w:val="28"/>
+          <w:szCs w:val="28"/>
+          <w:lang w:val="en-US"/>
+        </w:rPr>
+        <w:t>disparity</w:t>
+      </w:r>
+      <w:r>
+        <w:rPr>
+          <w:sz w:val="28"/>
+          <w:szCs w:val="28"/>
+        </w:rPr>
+        <w:t xml:space="preserve"> </w:t>
+      </w:r>
+      <w:r>
+        <w:rPr>
+          <w:sz w:val="28"/>
+          <w:szCs w:val="28"/>
+        </w:rPr>
+        <w:t>≈</w:t>
+      </w:r>
+      <w:r>
+        <w:rPr>
+          <w:sz w:val="28"/>
+          <w:szCs w:val="28"/>
+        </w:rPr>
+        <w:t xml:space="preserve"> 0.1-0.3 - </w:t>
+      </w:r>
+      <w:r>
+        <w:rPr>
+          <w:sz w:val="28"/>
+          <w:szCs w:val="28"/>
+        </w:rPr>
+        <w:t>небольшая, обычно ожидаемая неравномерность</w:t>
+      </w:r>
+      <w:r>
+        <w:rPr>
+          <w:sz w:val="28"/>
+          <w:szCs w:val="28"/>
+        </w:rPr>
+        <w:t>;</w:t>
+      </w:r>
+    </w:p>
+    <w:p>
+      <w:pPr>
+        <w:pStyle w:val="a3"/>
+        <w:numPr>
+          <w:ilvl w:val="1"/>
+          <w:numId w:val="10"/>
+        </w:numPr>
+        <w:rPr>
+          <w:sz w:val="28"/>
+          <w:szCs w:val="28"/>
+        </w:rPr>
+      </w:pPr>
+      <w:r>
+        <w:rPr>
+          <w:sz w:val="28"/>
+          <w:szCs w:val="28"/>
+          <w:lang w:val="en-US"/>
+        </w:rPr>
+        <w:t>disparity</w:t>
+      </w:r>
+      <w:r>
+        <w:rPr>
+          <w:sz w:val="28"/>
+          <w:szCs w:val="28"/>
+        </w:rPr>
+        <w:t xml:space="preserve"> &gt;= 1 – </w:t>
+      </w:r>
+      <w:r>
+        <w:rPr>
+          <w:sz w:val="28"/>
+          <w:szCs w:val="28"/>
+        </w:rPr>
+        <w:t>огромная неравномерность; математически означает, что стандартное отклонение нагрузки сопоставимо со средним значением; фактически, означает, что одни сервера перегружены, а другие – простаивают.</w:t>
       </w:r>
     </w:p>
     <w:p>
@@ -7548,14 +7786,968 @@
           <w:szCs w:val="36"/>
           <w:u w:val="single"/>
         </w:rPr>
-        <w:t>Анализ данных и в</w:t>
-      </w:r>
-      <w:r>
+        <w:t>Анализ данных</w:t>
+      </w:r>
+    </w:p>
+    <w:p>
+      <w:pPr>
+        <w:rPr>
+          <w:sz w:val="28"/>
+          <w:szCs w:val="28"/>
+        </w:rPr>
+      </w:pPr>
+      <w:r>
+        <w:rPr>
+          <w:sz w:val="28"/>
+          <w:szCs w:val="28"/>
+        </w:rPr>
+        <w:t xml:space="preserve">При анализе данных сразу было видно, что в сценариях с серверами одинаковой мощности алгоритмы </w:t>
+      </w:r>
+      <w:r>
+        <w:rPr>
+          <w:sz w:val="28"/>
+          <w:szCs w:val="28"/>
+          <w:lang w:val="en-US"/>
+        </w:rPr>
+        <w:t>Round</w:t>
+      </w:r>
+      <w:r>
+        <w:rPr>
+          <w:sz w:val="28"/>
+          <w:szCs w:val="28"/>
+        </w:rPr>
+        <w:t xml:space="preserve"> </w:t>
+      </w:r>
+      <w:r>
+        <w:rPr>
+          <w:sz w:val="28"/>
+          <w:szCs w:val="28"/>
+          <w:lang w:val="en-US"/>
+        </w:rPr>
+        <w:t>Robin</w:t>
+      </w:r>
+      <w:r>
+        <w:rPr>
+          <w:sz w:val="28"/>
+          <w:szCs w:val="28"/>
+        </w:rPr>
+        <w:t xml:space="preserve">, </w:t>
+      </w:r>
+      <w:r>
+        <w:rPr>
+          <w:sz w:val="28"/>
+          <w:szCs w:val="28"/>
+          <w:lang w:val="en-US"/>
+        </w:rPr>
+        <w:t>Weighted</w:t>
+      </w:r>
+      <w:r>
+        <w:rPr>
+          <w:sz w:val="28"/>
+          <w:szCs w:val="28"/>
+        </w:rPr>
+        <w:t xml:space="preserve"> </w:t>
+      </w:r>
+      <w:r>
+        <w:rPr>
+          <w:sz w:val="28"/>
+          <w:szCs w:val="28"/>
+          <w:lang w:val="en-US"/>
+        </w:rPr>
+        <w:t>Round</w:t>
+      </w:r>
+      <w:r>
+        <w:rPr>
+          <w:sz w:val="28"/>
+          <w:szCs w:val="28"/>
+        </w:rPr>
+        <w:t xml:space="preserve"> </w:t>
+      </w:r>
+      <w:r>
+        <w:rPr>
+          <w:sz w:val="28"/>
+          <w:szCs w:val="28"/>
+          <w:lang w:val="en-US"/>
+        </w:rPr>
+        <w:t>Robin</w:t>
+      </w:r>
+      <w:r>
+        <w:rPr>
+          <w:sz w:val="28"/>
+          <w:szCs w:val="28"/>
+        </w:rPr>
+        <w:t xml:space="preserve"> </w:t>
+      </w:r>
+      <w:r>
+        <w:rPr>
+          <w:sz w:val="28"/>
+          <w:szCs w:val="28"/>
+        </w:rPr>
+        <w:t xml:space="preserve">и </w:t>
+      </w:r>
+      <w:r>
+        <w:rPr>
+          <w:sz w:val="28"/>
+          <w:szCs w:val="28"/>
+          <w:lang w:val="en-US"/>
+        </w:rPr>
+        <w:t>Least</w:t>
+      </w:r>
+      <w:r>
+        <w:rPr>
+          <w:sz w:val="28"/>
+          <w:szCs w:val="28"/>
+        </w:rPr>
+        <w:t xml:space="preserve"> </w:t>
+      </w:r>
+      <w:r>
+        <w:rPr>
+          <w:sz w:val="28"/>
+          <w:szCs w:val="28"/>
+          <w:lang w:val="en-US"/>
+        </w:rPr>
+        <w:t>Connections</w:t>
+      </w:r>
+      <w:r>
+        <w:rPr>
+          <w:sz w:val="28"/>
+          <w:szCs w:val="28"/>
+        </w:rPr>
+        <w:t xml:space="preserve"> </w:t>
+      </w:r>
+      <w:r>
+        <w:rPr>
+          <w:sz w:val="28"/>
+          <w:szCs w:val="28"/>
+        </w:rPr>
+        <w:t xml:space="preserve">выдают практически одинаковую латентность и </w:t>
+      </w:r>
+      <w:r>
+        <w:rPr>
+          <w:sz w:val="28"/>
+          <w:szCs w:val="28"/>
+          <w:lang w:val="en-US"/>
+        </w:rPr>
+        <w:t>throughput</w:t>
+      </w:r>
+      <w:r>
+        <w:rPr>
+          <w:sz w:val="28"/>
+          <w:szCs w:val="28"/>
+        </w:rPr>
+        <w:t>.</w:t>
+      </w:r>
+      <w:r>
+        <w:rPr>
+          <w:sz w:val="28"/>
+          <w:szCs w:val="28"/>
+        </w:rPr>
+        <w:br/>
+      </w:r>
+      <w:r>
+        <w:rPr>
+          <w:sz w:val="28"/>
+          <w:szCs w:val="28"/>
+          <w:lang w:val="en-US"/>
+        </w:rPr>
+        <w:t>Least</w:t>
+      </w:r>
+      <w:r>
+        <w:rPr>
+          <w:sz w:val="28"/>
+          <w:szCs w:val="28"/>
+        </w:rPr>
+        <w:t xml:space="preserve"> </w:t>
+      </w:r>
+      <w:r>
+        <w:rPr>
+          <w:sz w:val="28"/>
+          <w:szCs w:val="28"/>
+          <w:lang w:val="en-US"/>
+        </w:rPr>
+        <w:t>Connections</w:t>
+      </w:r>
+      <w:r>
+        <w:rPr>
+          <w:sz w:val="28"/>
+          <w:szCs w:val="28"/>
+        </w:rPr>
+        <w:t xml:space="preserve"> </w:t>
+      </w:r>
+      <w:r>
+        <w:rPr>
+          <w:sz w:val="28"/>
+          <w:szCs w:val="28"/>
+        </w:rPr>
+        <w:t xml:space="preserve">иногда немного обгонял остальные алгоритмы в </w:t>
+      </w:r>
+      <w:r>
+        <w:rPr>
+          <w:sz w:val="28"/>
+          <w:szCs w:val="28"/>
+          <w:lang w:val="en-US"/>
+        </w:rPr>
+        <w:t>hard</w:t>
+      </w:r>
+      <w:r>
+        <w:rPr>
+          <w:sz w:val="28"/>
+          <w:szCs w:val="28"/>
+        </w:rPr>
+        <w:t xml:space="preserve"> </w:t>
+      </w:r>
+      <w:r>
+        <w:rPr>
+          <w:sz w:val="28"/>
+          <w:szCs w:val="28"/>
+        </w:rPr>
+        <w:t>сценариях.</w:t>
+      </w:r>
+    </w:p>
+    <w:p>
+      <w:pPr>
+        <w:rPr>
+          <w:sz w:val="28"/>
+          <w:szCs w:val="28"/>
+        </w:rPr>
+      </w:pPr>
+      <w:r>
+        <w:rPr>
+          <w:sz w:val="28"/>
+          <w:szCs w:val="28"/>
+          <w:lang w:val="en-US"/>
+        </w:rPr>
+        <w:t>Round</w:t>
+      </w:r>
+      <w:r>
+        <w:rPr>
+          <w:sz w:val="28"/>
+          <w:szCs w:val="28"/>
+        </w:rPr>
+        <w:t xml:space="preserve"> </w:t>
+      </w:r>
+      <w:r>
+        <w:rPr>
+          <w:sz w:val="28"/>
+          <w:szCs w:val="28"/>
+          <w:lang w:val="en-US"/>
+        </w:rPr>
+        <w:t>Robin</w:t>
+      </w:r>
+      <w:r>
+        <w:rPr>
+          <w:sz w:val="28"/>
+          <w:szCs w:val="28"/>
+        </w:rPr>
+        <w:t xml:space="preserve"> </w:t>
+      </w:r>
+      <w:r>
+        <w:rPr>
+          <w:sz w:val="28"/>
+          <w:szCs w:val="28"/>
+        </w:rPr>
+        <w:t>имеет</w:t>
+      </w:r>
+      <w:r>
+        <w:rPr>
+          <w:sz w:val="28"/>
+          <w:szCs w:val="28"/>
+        </w:rPr>
+        <w:t xml:space="preserve"> </w:t>
+      </w:r>
+      <w:r>
+        <w:rPr>
+          <w:sz w:val="28"/>
+          <w:szCs w:val="28"/>
+        </w:rPr>
+        <w:t xml:space="preserve">средний коэффициент </w:t>
+      </w:r>
+      <w:r>
+        <w:rPr>
+          <w:sz w:val="28"/>
+          <w:szCs w:val="28"/>
+          <w:lang w:val="en-US"/>
+        </w:rPr>
+        <w:t>disparity</w:t>
+      </w:r>
+      <w:r>
+        <w:rPr>
+          <w:sz w:val="28"/>
+          <w:szCs w:val="28"/>
+        </w:rPr>
+        <w:t xml:space="preserve"> </w:t>
+      </w:r>
+      <w:r>
+        <w:rPr>
+          <w:sz w:val="28"/>
+          <w:szCs w:val="28"/>
+        </w:rPr>
+        <w:t xml:space="preserve">в «простых» тестах (есть результаты, в которых нагрузка на сервера была не точно оценена из-за того, насколько она мала, например, </w:t>
+      </w:r>
+      <w:proofErr w:type="spellStart"/>
+      <w:r>
+        <w:rPr>
+          <w:sz w:val="28"/>
+          <w:szCs w:val="28"/>
+        </w:rPr>
+        <w:t>burstNormHMS_medium</w:t>
+      </w:r>
+      <w:proofErr w:type="spellEnd"/>
+      <w:r>
+        <w:rPr>
+          <w:sz w:val="28"/>
+          <w:szCs w:val="28"/>
+        </w:rPr>
+        <w:t>: они не идут в расчёт), но</w:t>
+      </w:r>
+      <w:r>
+        <w:rPr>
+          <w:sz w:val="28"/>
+          <w:szCs w:val="28"/>
+        </w:rPr>
+        <w:t xml:space="preserve"> очень высокий в сценариях с разными серверами: во всех тестах, в которых средняя нагрузка на сервер больше 1%, </w:t>
+      </w:r>
+      <w:r>
+        <w:rPr>
+          <w:sz w:val="28"/>
+          <w:szCs w:val="28"/>
+          <w:lang w:val="en-US"/>
+        </w:rPr>
+        <w:t>disparity</w:t>
+      </w:r>
+      <w:r>
+        <w:rPr>
+          <w:sz w:val="28"/>
+          <w:szCs w:val="28"/>
+        </w:rPr>
+        <w:t xml:space="preserve"> </w:t>
+      </w:r>
+      <w:r>
+        <w:rPr>
+          <w:sz w:val="28"/>
+          <w:szCs w:val="28"/>
+        </w:rPr>
+        <w:t xml:space="preserve">этого алгоритма </w:t>
+      </w:r>
+      <w:r>
+        <w:rPr>
+          <w:sz w:val="28"/>
+          <w:szCs w:val="28"/>
+        </w:rPr>
+        <w:t>сравним с 1 или даже п</w:t>
+      </w:r>
+      <w:r>
+        <w:rPr>
+          <w:sz w:val="28"/>
+          <w:szCs w:val="28"/>
+        </w:rPr>
+        <w:t>ревышает 1.</w:t>
+      </w:r>
+    </w:p>
+    <w:p>
+      <w:pPr>
+        <w:rPr>
+          <w:sz w:val="28"/>
+          <w:szCs w:val="28"/>
+        </w:rPr>
+      </w:pPr>
+      <w:r>
+        <w:rPr>
+          <w:sz w:val="28"/>
+          <w:szCs w:val="28"/>
+          <w:lang w:val="en-US"/>
+        </w:rPr>
+        <w:t>Weighted</w:t>
+      </w:r>
+      <w:r>
+        <w:rPr>
+          <w:sz w:val="28"/>
+          <w:szCs w:val="28"/>
+        </w:rPr>
+        <w:t xml:space="preserve"> </w:t>
+      </w:r>
+      <w:r>
+        <w:rPr>
+          <w:sz w:val="28"/>
+          <w:szCs w:val="28"/>
+          <w:lang w:val="en-US"/>
+        </w:rPr>
+        <w:t>Round</w:t>
+      </w:r>
+      <w:r>
+        <w:rPr>
+          <w:sz w:val="28"/>
+          <w:szCs w:val="28"/>
+        </w:rPr>
+        <w:t xml:space="preserve"> </w:t>
+      </w:r>
+      <w:r>
+        <w:rPr>
+          <w:sz w:val="28"/>
+          <w:szCs w:val="28"/>
+          <w:lang w:val="en-US"/>
+        </w:rPr>
+        <w:t>Robin</w:t>
+      </w:r>
+      <w:r>
+        <w:rPr>
+          <w:sz w:val="28"/>
+          <w:szCs w:val="28"/>
+        </w:rPr>
+        <w:t xml:space="preserve"> </w:t>
+      </w:r>
+      <w:r>
+        <w:rPr>
+          <w:sz w:val="28"/>
+          <w:szCs w:val="28"/>
+        </w:rPr>
+        <w:t>показывает</w:t>
+      </w:r>
+      <w:r>
+        <w:rPr>
+          <w:sz w:val="28"/>
+          <w:szCs w:val="28"/>
+        </w:rPr>
+        <w:t xml:space="preserve"> </w:t>
+      </w:r>
+      <w:r>
+        <w:rPr>
+          <w:sz w:val="28"/>
+          <w:szCs w:val="28"/>
+        </w:rPr>
+        <w:t>низкий</w:t>
+      </w:r>
+      <w:r>
+        <w:rPr>
+          <w:sz w:val="28"/>
+          <w:szCs w:val="28"/>
+        </w:rPr>
+        <w:t xml:space="preserve"> </w:t>
+      </w:r>
+      <w:r>
+        <w:rPr>
+          <w:sz w:val="28"/>
+          <w:szCs w:val="28"/>
+        </w:rPr>
+        <w:t xml:space="preserve">уровень </w:t>
+      </w:r>
+      <w:r>
+        <w:rPr>
+          <w:sz w:val="28"/>
+          <w:szCs w:val="28"/>
+          <w:lang w:val="en-US"/>
+        </w:rPr>
+        <w:t>disparity</w:t>
+      </w:r>
+      <w:r>
+        <w:rPr>
+          <w:sz w:val="28"/>
+          <w:szCs w:val="28"/>
+        </w:rPr>
+        <w:t xml:space="preserve"> </w:t>
+      </w:r>
+      <w:r>
+        <w:rPr>
+          <w:sz w:val="28"/>
+          <w:szCs w:val="28"/>
+        </w:rPr>
+        <w:t xml:space="preserve">на «простых» </w:t>
+      </w:r>
+      <w:proofErr w:type="spellStart"/>
+      <w:r>
+        <w:rPr>
+          <w:sz w:val="28"/>
+          <w:szCs w:val="28"/>
+        </w:rPr>
+        <w:t>пресетах</w:t>
+      </w:r>
+      <w:proofErr w:type="spellEnd"/>
+      <w:r>
+        <w:rPr>
+          <w:sz w:val="28"/>
+          <w:szCs w:val="28"/>
+        </w:rPr>
+        <w:t xml:space="preserve"> – в районе 0.</w:t>
+      </w:r>
+      <w:r>
+        <w:rPr>
+          <w:sz w:val="28"/>
+          <w:szCs w:val="28"/>
+        </w:rPr>
+        <w:t>2</w:t>
+      </w:r>
+      <w:r>
+        <w:rPr>
+          <w:sz w:val="28"/>
+          <w:szCs w:val="28"/>
+        </w:rPr>
+        <w:t xml:space="preserve">, около 0.5 на «средних», и около 0.8 на «сложных», </w:t>
+      </w:r>
+      <w:r>
+        <w:rPr>
+          <w:sz w:val="28"/>
+          <w:szCs w:val="28"/>
+        </w:rPr>
+        <w:lastRenderedPageBreak/>
+        <w:t xml:space="preserve">однако стоит отметить, что все алгоритмы показали высокий уровень </w:t>
+      </w:r>
+      <w:r>
+        <w:rPr>
+          <w:sz w:val="28"/>
+          <w:szCs w:val="28"/>
+          <w:lang w:val="en-US"/>
+        </w:rPr>
+        <w:t>disparity</w:t>
+      </w:r>
+      <w:r>
+        <w:rPr>
+          <w:sz w:val="28"/>
+          <w:szCs w:val="28"/>
+        </w:rPr>
+        <w:t xml:space="preserve"> </w:t>
+      </w:r>
+      <w:r>
+        <w:rPr>
+          <w:sz w:val="28"/>
+          <w:szCs w:val="28"/>
+        </w:rPr>
+        <w:t xml:space="preserve">на этих тестах и у </w:t>
+      </w:r>
+      <w:r>
+        <w:rPr>
+          <w:sz w:val="28"/>
+          <w:szCs w:val="28"/>
+          <w:lang w:val="en-US"/>
+        </w:rPr>
+        <w:t>Weighted</w:t>
+      </w:r>
+      <w:r>
+        <w:rPr>
+          <w:sz w:val="28"/>
+          <w:szCs w:val="28"/>
+        </w:rPr>
+        <w:t xml:space="preserve"> </w:t>
+      </w:r>
+      <w:r>
+        <w:rPr>
+          <w:sz w:val="28"/>
+          <w:szCs w:val="28"/>
+          <w:lang w:val="en-US"/>
+        </w:rPr>
+        <w:t>Round</w:t>
+      </w:r>
+      <w:r>
+        <w:rPr>
+          <w:sz w:val="28"/>
+          <w:szCs w:val="28"/>
+        </w:rPr>
+        <w:t xml:space="preserve"> </w:t>
+      </w:r>
+      <w:r>
+        <w:rPr>
+          <w:sz w:val="28"/>
+          <w:szCs w:val="28"/>
+          <w:lang w:val="en-US"/>
+        </w:rPr>
+        <w:t>Robin</w:t>
+      </w:r>
+      <w:r>
+        <w:rPr>
+          <w:sz w:val="28"/>
+          <w:szCs w:val="28"/>
+        </w:rPr>
+        <w:t xml:space="preserve"> </w:t>
+      </w:r>
+      <w:r>
+        <w:rPr>
+          <w:sz w:val="28"/>
+          <w:szCs w:val="28"/>
+        </w:rPr>
+        <w:t>показатели наилучшие.</w:t>
+      </w:r>
+    </w:p>
+    <w:p>
+      <w:pPr>
+        <w:rPr>
+          <w:sz w:val="28"/>
+          <w:szCs w:val="28"/>
+        </w:rPr>
+      </w:pPr>
+      <w:r>
+        <w:rPr>
+          <w:sz w:val="28"/>
+          <w:szCs w:val="28"/>
+        </w:rPr>
+        <w:t>Видно</w:t>
+      </w:r>
+      <w:r>
+        <w:rPr>
+          <w:sz w:val="28"/>
+          <w:szCs w:val="28"/>
+        </w:rPr>
+        <w:t xml:space="preserve">, </w:t>
+      </w:r>
+      <w:r>
+        <w:rPr>
+          <w:sz w:val="28"/>
+          <w:szCs w:val="28"/>
+        </w:rPr>
+        <w:t>что</w:t>
+      </w:r>
+      <w:r>
+        <w:rPr>
+          <w:sz w:val="28"/>
+          <w:szCs w:val="28"/>
+        </w:rPr>
+        <w:t xml:space="preserve"> </w:t>
+      </w:r>
+      <w:r>
+        <w:rPr>
+          <w:sz w:val="28"/>
+          <w:szCs w:val="28"/>
+          <w:lang w:val="en-US"/>
+        </w:rPr>
+        <w:t>Consistent</w:t>
+      </w:r>
+      <w:r>
+        <w:rPr>
+          <w:sz w:val="28"/>
+          <w:szCs w:val="28"/>
+        </w:rPr>
+        <w:t xml:space="preserve"> </w:t>
+      </w:r>
+      <w:r>
+        <w:rPr>
+          <w:sz w:val="28"/>
+          <w:szCs w:val="28"/>
+          <w:lang w:val="en-US"/>
+        </w:rPr>
+        <w:t>Hashing</w:t>
+      </w:r>
+      <w:r>
+        <w:rPr>
+          <w:sz w:val="28"/>
+          <w:szCs w:val="28"/>
+        </w:rPr>
+        <w:t xml:space="preserve"> </w:t>
+      </w:r>
+      <w:r>
+        <w:rPr>
+          <w:sz w:val="28"/>
+          <w:szCs w:val="28"/>
+        </w:rPr>
+        <w:t>уступает</w:t>
+      </w:r>
+      <w:r>
+        <w:rPr>
+          <w:sz w:val="28"/>
+          <w:szCs w:val="28"/>
+        </w:rPr>
+        <w:t xml:space="preserve"> </w:t>
+      </w:r>
+      <w:r>
+        <w:rPr>
+          <w:sz w:val="28"/>
+          <w:szCs w:val="28"/>
+        </w:rPr>
+        <w:t>в</w:t>
+      </w:r>
+      <w:r>
+        <w:rPr>
+          <w:sz w:val="28"/>
+          <w:szCs w:val="28"/>
+        </w:rPr>
+        <w:t xml:space="preserve"> </w:t>
+      </w:r>
+      <w:r>
+        <w:rPr>
+          <w:sz w:val="28"/>
+          <w:szCs w:val="28"/>
+        </w:rPr>
+        <w:t>плане</w:t>
+      </w:r>
+      <w:r>
+        <w:rPr>
+          <w:sz w:val="28"/>
+          <w:szCs w:val="28"/>
+        </w:rPr>
+        <w:t xml:space="preserve"> </w:t>
+      </w:r>
+      <w:r>
+        <w:rPr>
+          <w:sz w:val="28"/>
+          <w:szCs w:val="28"/>
+          <w:lang w:val="en-US"/>
+        </w:rPr>
+        <w:t>latency</w:t>
+      </w:r>
+      <w:r>
+        <w:rPr>
+          <w:sz w:val="28"/>
+          <w:szCs w:val="28"/>
+        </w:rPr>
+        <w:t xml:space="preserve"> </w:t>
+      </w:r>
+      <w:r>
+        <w:rPr>
+          <w:sz w:val="28"/>
+          <w:szCs w:val="28"/>
+        </w:rPr>
+        <w:t>и</w:t>
+      </w:r>
+      <w:r>
+        <w:rPr>
+          <w:sz w:val="28"/>
+          <w:szCs w:val="28"/>
+        </w:rPr>
+        <w:t xml:space="preserve"> </w:t>
+      </w:r>
+      <w:r>
+        <w:rPr>
+          <w:sz w:val="28"/>
+          <w:szCs w:val="28"/>
+          <w:lang w:val="en-US"/>
+        </w:rPr>
+        <w:t>throughput</w:t>
+      </w:r>
+      <w:r>
+        <w:rPr>
+          <w:sz w:val="28"/>
+          <w:szCs w:val="28"/>
+        </w:rPr>
+        <w:t xml:space="preserve">: </w:t>
+      </w:r>
+      <w:r>
+        <w:rPr>
+          <w:sz w:val="28"/>
+          <w:szCs w:val="28"/>
+        </w:rPr>
+        <w:t xml:space="preserve">в среднем проигрыш в 20% по </w:t>
+      </w:r>
+      <w:r>
+        <w:rPr>
+          <w:sz w:val="28"/>
+          <w:szCs w:val="28"/>
+          <w:lang w:val="en-US"/>
+        </w:rPr>
+        <w:t>throughput</w:t>
+      </w:r>
+      <w:r>
+        <w:rPr>
+          <w:sz w:val="28"/>
+          <w:szCs w:val="28"/>
+        </w:rPr>
+        <w:t xml:space="preserve">. </w:t>
+      </w:r>
+      <w:r>
+        <w:rPr>
+          <w:sz w:val="28"/>
+          <w:szCs w:val="28"/>
+        </w:rPr>
+        <w:t>Особенно это заметно в сценариях с серверами разной мощности.</w:t>
+      </w:r>
+    </w:p>
+    <w:p>
+      <w:pPr>
+        <w:rPr>
+          <w:sz w:val="28"/>
+          <w:szCs w:val="28"/>
+        </w:rPr>
+      </w:pPr>
+      <w:r>
+        <w:rPr>
+          <w:sz w:val="28"/>
+          <w:szCs w:val="28"/>
+        </w:rPr>
+        <w:t xml:space="preserve">Самыми неожиданными результатами оказались показатели </w:t>
+      </w:r>
+      <w:r>
+        <w:rPr>
+          <w:sz w:val="28"/>
+          <w:szCs w:val="28"/>
+          <w:lang w:val="en-US"/>
+        </w:rPr>
+        <w:t>disparity</w:t>
+      </w:r>
+      <w:r>
+        <w:rPr>
+          <w:sz w:val="28"/>
+          <w:szCs w:val="28"/>
+        </w:rPr>
+        <w:t xml:space="preserve"> </w:t>
+      </w:r>
+      <w:r>
+        <w:rPr>
+          <w:sz w:val="28"/>
+          <w:szCs w:val="28"/>
+        </w:rPr>
+        <w:t xml:space="preserve">у </w:t>
+      </w:r>
+      <w:r>
+        <w:rPr>
+          <w:sz w:val="28"/>
+          <w:szCs w:val="28"/>
+          <w:lang w:val="en-US"/>
+        </w:rPr>
+        <w:t>Least</w:t>
+      </w:r>
+      <w:r>
+        <w:rPr>
+          <w:sz w:val="28"/>
+          <w:szCs w:val="28"/>
+        </w:rPr>
+        <w:t xml:space="preserve"> </w:t>
+      </w:r>
+      <w:r>
+        <w:rPr>
+          <w:sz w:val="28"/>
+          <w:szCs w:val="28"/>
+          <w:lang w:val="en-US"/>
+        </w:rPr>
+        <w:t>Connections</w:t>
+      </w:r>
+      <w:r>
+        <w:rPr>
+          <w:sz w:val="28"/>
+          <w:szCs w:val="28"/>
+        </w:rPr>
+        <w:t xml:space="preserve">: </w:t>
+      </w:r>
+      <w:r>
+        <w:rPr>
+          <w:sz w:val="28"/>
+          <w:szCs w:val="28"/>
+        </w:rPr>
+        <w:t xml:space="preserve">даже на «простых» случаях, </w:t>
+      </w:r>
+      <w:r>
+        <w:rPr>
+          <w:sz w:val="28"/>
+          <w:szCs w:val="28"/>
+          <w:lang w:val="en-US"/>
+        </w:rPr>
+        <w:t>Least</w:t>
+      </w:r>
+      <w:r>
+        <w:rPr>
+          <w:sz w:val="28"/>
+          <w:szCs w:val="28"/>
+        </w:rPr>
+        <w:t xml:space="preserve"> </w:t>
+      </w:r>
+      <w:r>
+        <w:rPr>
+          <w:sz w:val="28"/>
+          <w:szCs w:val="28"/>
+          <w:lang w:val="en-US"/>
+        </w:rPr>
+        <w:t>Connections</w:t>
+      </w:r>
+      <w:r>
+        <w:rPr>
+          <w:sz w:val="28"/>
+          <w:szCs w:val="28"/>
+        </w:rPr>
+        <w:t xml:space="preserve"> </w:t>
+      </w:r>
+      <w:r>
+        <w:rPr>
+          <w:sz w:val="28"/>
+          <w:szCs w:val="28"/>
+        </w:rPr>
+        <w:t xml:space="preserve">выдавал </w:t>
+      </w:r>
+      <w:proofErr w:type="gramStart"/>
+      <w:r>
+        <w:rPr>
+          <w:sz w:val="28"/>
+          <w:szCs w:val="28"/>
+          <w:lang w:val="en-US"/>
+        </w:rPr>
+        <w:t>disparity</w:t>
+      </w:r>
+      <w:r>
+        <w:rPr>
+          <w:sz w:val="28"/>
+          <w:szCs w:val="28"/>
+        </w:rPr>
+        <w:t xml:space="preserve"> &gt;</w:t>
+      </w:r>
+      <w:proofErr w:type="gramEnd"/>
+      <w:r>
+        <w:rPr>
+          <w:sz w:val="28"/>
+          <w:szCs w:val="28"/>
+        </w:rPr>
+        <w:t xml:space="preserve">= 0.5, </w:t>
+      </w:r>
+      <w:r>
+        <w:rPr>
+          <w:sz w:val="28"/>
+          <w:szCs w:val="28"/>
+        </w:rPr>
+        <w:t>даже чаще в диапазоне 0.8-1.2</w:t>
+      </w:r>
+      <w:r>
+        <w:rPr>
+          <w:sz w:val="28"/>
+          <w:szCs w:val="28"/>
+        </w:rPr>
+        <w:t>. Явно видно, как алгоритм перегружает один из серверов – чаще всего самый слабый.</w:t>
+      </w:r>
+      <w:r>
+        <w:rPr>
+          <w:sz w:val="28"/>
+          <w:szCs w:val="28"/>
+        </w:rPr>
+        <w:br/>
+        <w:t xml:space="preserve">Несмотря на это, в «сложных» ситуациях алгоритм выдавал наибольший </w:t>
+      </w:r>
+      <w:r>
+        <w:rPr>
+          <w:sz w:val="28"/>
+          <w:szCs w:val="28"/>
+          <w:lang w:val="en-US"/>
+        </w:rPr>
+        <w:t>throughput</w:t>
+      </w:r>
+      <w:r>
+        <w:rPr>
+          <w:sz w:val="28"/>
+          <w:szCs w:val="28"/>
+        </w:rPr>
+        <w:t xml:space="preserve"> </w:t>
+      </w:r>
+      <w:r>
+        <w:rPr>
+          <w:sz w:val="28"/>
+          <w:szCs w:val="28"/>
+        </w:rPr>
+        <w:t>из всех.</w:t>
+      </w:r>
+    </w:p>
+    <w:p>
+      <w:pPr>
         <w:rPr>
           <w:sz w:val="36"/>
           <w:szCs w:val="36"/>
           <w:u w:val="single"/>
         </w:rPr>
+      </w:pPr>
+      <w:r>
+        <w:rPr>
+          <w:sz w:val="36"/>
+          <w:szCs w:val="36"/>
+          <w:u w:val="single"/>
+        </w:rPr>
+        <w:t>В</w:t>
+      </w:r>
+      <w:r>
+        <w:rPr>
+          <w:sz w:val="36"/>
+          <w:szCs w:val="36"/>
+          <w:u w:val="single"/>
+        </w:rPr>
         <w:t>ыводы</w:t>
       </w:r>
     </w:p>
@@ -7572,6 +8764,132 @@
           <w:szCs w:val="28"/>
         </w:rPr>
         <w:t>В результате анализа данных, некоторые гипотезы подтвердились, а некоторые были опровергнуты.</w:t>
+      </w:r>
+    </w:p>
+    <w:p>
+      <w:pPr>
+        <w:rPr>
+          <w:sz w:val="28"/>
+          <w:szCs w:val="28"/>
+        </w:rPr>
+      </w:pPr>
+      <w:r>
+        <w:rPr>
+          <w:sz w:val="28"/>
+          <w:szCs w:val="28"/>
+        </w:rPr>
+        <w:t>Гипотезы</w:t>
+      </w:r>
+      <w:r>
+        <w:rPr>
+          <w:sz w:val="28"/>
+          <w:szCs w:val="28"/>
+        </w:rPr>
+        <w:t xml:space="preserve"> </w:t>
+      </w:r>
+      <w:r>
+        <w:rPr>
+          <w:sz w:val="28"/>
+          <w:szCs w:val="28"/>
+        </w:rPr>
+        <w:t>о</w:t>
+      </w:r>
+      <w:r>
+        <w:rPr>
+          <w:sz w:val="28"/>
+          <w:szCs w:val="28"/>
+        </w:rPr>
+        <w:t xml:space="preserve"> </w:t>
+      </w:r>
+      <w:r>
+        <w:rPr>
+          <w:sz w:val="28"/>
+          <w:szCs w:val="28"/>
+          <w:lang w:val="en-US"/>
+        </w:rPr>
+        <w:t>Round</w:t>
+      </w:r>
+      <w:r>
+        <w:rPr>
+          <w:sz w:val="28"/>
+          <w:szCs w:val="28"/>
+        </w:rPr>
+        <w:t xml:space="preserve"> </w:t>
+      </w:r>
+      <w:r>
+        <w:rPr>
+          <w:sz w:val="28"/>
+          <w:szCs w:val="28"/>
+          <w:lang w:val="en-US"/>
+        </w:rPr>
+        <w:t>Robin</w:t>
+      </w:r>
+      <w:r>
+        <w:rPr>
+          <w:sz w:val="28"/>
+          <w:szCs w:val="28"/>
+        </w:rPr>
+        <w:t xml:space="preserve"> </w:t>
+      </w:r>
+      <w:r>
+        <w:rPr>
+          <w:sz w:val="28"/>
+          <w:szCs w:val="28"/>
+        </w:rPr>
+        <w:t>подтвердились</w:t>
+      </w:r>
+      <w:r>
+        <w:rPr>
+          <w:sz w:val="28"/>
+          <w:szCs w:val="28"/>
+        </w:rPr>
+        <w:t xml:space="preserve">: </w:t>
+      </w:r>
+      <w:r>
+        <w:rPr>
+          <w:sz w:val="28"/>
+          <w:szCs w:val="28"/>
+        </w:rPr>
+        <w:t xml:space="preserve">алгоритм наименьший </w:t>
+      </w:r>
+      <w:r>
+        <w:rPr>
+          <w:sz w:val="28"/>
+          <w:szCs w:val="28"/>
+          <w:lang w:val="en-US"/>
+        </w:rPr>
+        <w:t>disparity</w:t>
+      </w:r>
+      <w:r>
+        <w:rPr>
+          <w:sz w:val="28"/>
+          <w:szCs w:val="28"/>
+        </w:rPr>
+        <w:t xml:space="preserve"> </w:t>
+      </w:r>
+      <w:r>
+        <w:rPr>
+          <w:sz w:val="28"/>
+          <w:szCs w:val="28"/>
+        </w:rPr>
+        <w:t xml:space="preserve">и наибольший </w:t>
+      </w:r>
+      <w:proofErr w:type="spellStart"/>
+      <w:r>
+        <w:rPr>
+          <w:sz w:val="28"/>
+          <w:szCs w:val="28"/>
+          <w:lang w:val="en-US"/>
+        </w:rPr>
+        <w:t>throughpit</w:t>
+      </w:r>
+      <w:proofErr w:type="spellEnd"/>
+      <w:r>
+        <w:rPr>
+          <w:sz w:val="28"/>
+          <w:szCs w:val="28"/>
+        </w:rPr>
+        <w:t xml:space="preserve"> </w:t>
       </w:r>
     </w:p>
     <w:p>
@@ -9157,7 +10475,7 @@
   <w:abstractNum w:abstractNumId="5" w15:restartNumberingAfterBreak="0">
     <w:nsid w:val="4AE043D3"/>
     <w:multiLevelType w:val="hybridMultilevel"/>
-    <w:tmpl w:val="ADDECFC4"/>
+    <w:tmpl w:val="1D7C8044"/>
     <w:lvl w:ilvl="0" w:tplc="04190001">
       <w:start w:val="1"/>
       <w:numFmt w:val="bullet"/>
@@ -9170,7 +10488,7 @@
         <w:rFonts w:ascii="Symbol" w:hAnsi="Symbol" w:hint="default"/>
       </w:rPr>
     </w:lvl>
-    <w:lvl w:ilvl="1" w:tplc="04190003" w:tentative="1">
+    <w:lvl w:ilvl="1" w:tplc="04190003">
       <w:start w:val="1"/>
       <w:numFmt w:val="bullet"/>
       <w:lvlText w:val="o"/>

</xml_diff>

<commit_message>
replaced a zaglushka in report with actual value
</commit_message>
<xml_diff>
--- a/final_report/Report.docx
+++ b/final_report/Report.docx
@@ -3708,16 +3708,7 @@
           <w:sz w:val="28"/>
           <w:szCs w:val="28"/>
         </w:rPr>
-        <w:t xml:space="preserve"> менеджера балансир</w:t>
-      </w:r>
-      <w:bookmarkStart w:id="0" w:name="_GoBack"/>
-      <w:bookmarkEnd w:id="0"/>
-      <w:r>
-        <w:rPr>
-          <w:sz w:val="28"/>
-          <w:szCs w:val="28"/>
-        </w:rPr>
-        <w:t>овки</w:t>
+        <w:t xml:space="preserve"> менеджера балансировки</w:t>
       </w:r>
     </w:p>
     <w:p>
@@ -4461,9 +4452,8 @@
         <w:rPr>
           <w:sz w:val="28"/>
           <w:szCs w:val="28"/>
-          <w:lang w:val="en-US"/>
-        </w:rPr>
-        <w:t>X</w:t>
+        </w:rPr>
+        <w:t>27</w:t>
       </w:r>
       <w:r>
         <w:rPr>
@@ -4630,7 +4620,16 @@
           <w:sz w:val="28"/>
           <w:szCs w:val="28"/>
         </w:rPr>
-        <w:t xml:space="preserve"> – идеально одинаковые запросы, </w:t>
+        <w:t xml:space="preserve"> – иде</w:t>
+      </w:r>
+      <w:bookmarkStart w:id="0" w:name="_GoBack"/>
+      <w:bookmarkEnd w:id="0"/>
+      <w:r>
+        <w:rPr>
+          <w:sz w:val="28"/>
+          <w:szCs w:val="28"/>
+        </w:rPr>
+        <w:t xml:space="preserve">ально одинаковые запросы, </w:t>
       </w:r>
       <w:proofErr w:type="spellStart"/>
       <w:r>
@@ -10263,7 +10262,23 @@
           <w:sz w:val="28"/>
           <w:szCs w:val="28"/>
         </w:rPr>
-        <w:t xml:space="preserve"> (балансировщик, менеджер, модель нагрузки, CLI</w:t>
+        <w:t xml:space="preserve"> (</w:t>
+      </w:r>
+      <w:proofErr w:type="spellStart"/>
+      <w:r>
+        <w:rPr>
+          <w:sz w:val="28"/>
+          <w:szCs w:val="28"/>
+        </w:rPr>
+        <w:t>балансировщик</w:t>
+      </w:r>
+      <w:proofErr w:type="spellEnd"/>
+      <w:r>
+        <w:rPr>
+          <w:sz w:val="28"/>
+          <w:szCs w:val="28"/>
+        </w:rPr>
+        <w:t>, менеджер, модель нагрузки, CLI</w:t>
       </w:r>
       <w:r>
         <w:rPr>
@@ -12647,6 +12662,7 @@
   <w:style w:type="character" w:default="1" w:styleId="a0">
     <w:name w:val="Default Paragraph Font"/>
     <w:uiPriority w:val="1"/>
+    <w:semiHidden/>
     <w:unhideWhenUsed/>
   </w:style>
   <w:style w:type="table" w:default="1" w:styleId="a1">

</xml_diff>